<commit_message>
Ajuste no documento de entrega
</commit_message>
<xml_diff>
--- a/Documento-Academico-Arquitetura-AWS.docx
+++ b/Documento-Academico-Arquitetura-AWS.docx
@@ -83,70 +83,106 @@
     </w:p>
     <w:p>
       <w:pPr>
-        <w:pStyle w:val="Subtitle"/>
-        <w:spacing w:after="2200" w:line="360" w:lineRule="auto"/>
-        <w:jc w:val="center"/>
-        <w:rPr/>
-      </w:pPr>
-      <w:r>
-        <w:rPr>
-          <w:rtl w:val="0"/>
-        </w:rPr>
-      </w:r>
-    </w:p>
-    <w:p>
-      <w:pPr>
-        <w:rPr/>
-      </w:pPr>
-      <w:r>
-        <w:rPr>
-          <w:rtl w:val="0"/>
-        </w:rPr>
-      </w:r>
-    </w:p>
-    <w:p>
-      <w:pPr>
-        <w:rPr/>
-      </w:pPr>
-      <w:r>
-        <w:rPr>
-          <w:rtl w:val="0"/>
-        </w:rPr>
-      </w:r>
-    </w:p>
-    <w:p>
-      <w:pPr>
-        <w:rPr/>
-      </w:pPr>
-      <w:r>
-        <w:rPr>
-          <w:rtl w:val="0"/>
-        </w:rPr>
-      </w:r>
-    </w:p>
-    <w:p>
-      <w:pPr>
-        <w:rPr/>
-      </w:pPr>
-      <w:r>
-        <w:rPr>
-          <w:rtl w:val="0"/>
-        </w:rPr>
-      </w:r>
-    </w:p>
-    <w:p>
-      <w:pPr>
-        <w:rPr/>
-      </w:pPr>
-      <w:r>
-        <w:rPr>
-          <w:rtl w:val="0"/>
-        </w:rPr>
-      </w:r>
-    </w:p>
-    <w:p>
-      <w:pPr>
-        <w:ind w:left="0" w:firstLine="0"/>
+        <w:rPr/>
+      </w:pPr>
+      <w:r>
+        <w:rPr>
+          <w:rtl w:val="0"/>
+        </w:rPr>
+      </w:r>
+    </w:p>
+    <w:p>
+      <w:pPr>
+        <w:rPr/>
+      </w:pPr>
+      <w:r>
+        <w:rPr>
+          <w:rtl w:val="0"/>
+        </w:rPr>
+      </w:r>
+    </w:p>
+    <w:p>
+      <w:pPr>
+        <w:rPr/>
+      </w:pPr>
+      <w:r>
+        <w:rPr>
+          <w:rtl w:val="0"/>
+        </w:rPr>
+      </w:r>
+    </w:p>
+    <w:p>
+      <w:pPr>
+        <w:rPr/>
+      </w:pPr>
+      <w:r>
+        <w:rPr>
+          <w:rtl w:val="0"/>
+        </w:rPr>
+      </w:r>
+    </w:p>
+    <w:p>
+      <w:pPr>
+        <w:rPr/>
+      </w:pPr>
+      <w:r>
+        <w:rPr>
+          <w:rtl w:val="0"/>
+        </w:rPr>
+      </w:r>
+    </w:p>
+    <w:p>
+      <w:pPr>
+        <w:rPr/>
+      </w:pPr>
+      <w:r>
+        <w:rPr>
+          <w:rtl w:val="0"/>
+        </w:rPr>
+      </w:r>
+    </w:p>
+    <w:p>
+      <w:pPr>
+        <w:rPr/>
+      </w:pPr>
+      <w:r>
+        <w:rPr>
+          <w:rtl w:val="0"/>
+        </w:rPr>
+      </w:r>
+    </w:p>
+    <w:p>
+      <w:pPr>
+        <w:rPr/>
+      </w:pPr>
+      <w:r>
+        <w:rPr>
+          <w:rtl w:val="0"/>
+        </w:rPr>
+      </w:r>
+    </w:p>
+    <w:p>
+      <w:pPr>
+        <w:rPr/>
+      </w:pPr>
+      <w:r>
+        <w:rPr>
+          <w:rtl w:val="0"/>
+        </w:rPr>
+      </w:r>
+    </w:p>
+    <w:p>
+      <w:pPr>
+        <w:rPr/>
+      </w:pPr>
+      <w:r>
+        <w:rPr>
+          <w:rtl w:val="0"/>
+        </w:rPr>
+      </w:r>
+    </w:p>
+    <w:p>
+      <w:pPr>
         <w:rPr/>
       </w:pPr>
       <w:r>
@@ -257,6 +293,2595 @@
           <w:rtl w:val="0"/>
         </w:rPr>
         <w:t xml:space="preserve">Local e data: Mossoró-RN, 20 de junho de 2026.</w:t>
+      </w:r>
+    </w:p>
+    <w:p>
+      <w:pPr>
+        <w:pStyle w:val="Heading1"/>
+        <w:spacing w:after="180" w:line="360" w:lineRule="auto"/>
+        <w:jc w:val="left"/>
+        <w:rPr/>
+      </w:pPr>
+      <w:r>
+        <w:rPr>
+          <w:b w:val="1"/>
+          <w:bCs w:val="1"/>
+          <w:rtl w:val="0"/>
+        </w:rPr>
+        <w:t xml:space="preserve">Tabela-resumo do C2</w:t>
+      </w:r>
+      <w:r>
+        <w:rPr>
+          <w:rtl w:val="0"/>
+        </w:rPr>
+      </w:r>
+    </w:p>
+    <w:tbl>
+      <w:tblPr>
+        <w:tblStyle w:val="Table1"/>
+        <w:tblW w:w="10200.0" w:type="dxa"/>
+        <w:jc w:val="left"/>
+        <w:tblInd w:w="-115.0" w:type="dxa"/>
+        <w:tblBorders>
+          <w:top w:color="000000" w:space="0" w:sz="8" w:val="single"/>
+          <w:left w:color="000000" w:space="0" w:sz="8" w:val="single"/>
+          <w:bottom w:color="000000" w:space="0" w:sz="8" w:val="single"/>
+          <w:right w:color="000000" w:space="0" w:sz="8" w:val="single"/>
+          <w:insideH w:color="000000" w:space="0" w:sz="8" w:val="single"/>
+          <w:insideV w:color="000000" w:space="0" w:sz="8" w:val="single"/>
+        </w:tblBorders>
+        <w:tblLayout w:type="fixed"/>
+        <w:tblLook w:val="0400"/>
+      </w:tblPr>
+      <w:tblGrid>
+        <w:gridCol w:w="1100"/>
+        <w:gridCol w:w="2400"/>
+        <w:gridCol w:w="3200"/>
+        <w:gridCol w:w="3500"/>
+        <w:tblGridChange w:id="0">
+          <w:tblGrid>
+            <w:gridCol w:w="1100"/>
+            <w:gridCol w:w="2400"/>
+            <w:gridCol w:w="3200"/>
+            <w:gridCol w:w="3500"/>
+          </w:tblGrid>
+        </w:tblGridChange>
+      </w:tblGrid>
+      <w:tr>
+        <w:trPr>
+          <w:cantSplit w:val="0"/>
+          <w:tblHeader w:val="0"/>
+        </w:trPr>
+        <w:tc>
+          <w:tcPr/>
+          <w:p>
+            <w:pPr>
+              <w:spacing w:after="60" w:line="300" w:lineRule="auto"/>
+              <w:ind w:left="0" w:firstLine="0"/>
+              <w:jc w:val="left"/>
+              <w:rPr/>
+            </w:pPr>
+            <w:r>
+              <w:rPr>
+                <w:b w:val="1"/>
+                <w:bCs w:val="1"/>
+                <w:rtl w:val="0"/>
+              </w:rPr>
+              <w:t xml:space="preserve">Bloco</w:t>
+            </w:r>
+            <w:r>
+              <w:rPr>
+                <w:rtl w:val="0"/>
+              </w:rPr>
+            </w:r>
+          </w:p>
+        </w:tc>
+        <w:tc>
+          <w:tcPr/>
+          <w:p>
+            <w:pPr>
+              <w:spacing w:after="60" w:line="300" w:lineRule="auto"/>
+              <w:jc w:val="left"/>
+              <w:rPr/>
+            </w:pPr>
+            <w:r>
+              <w:rPr>
+                <w:b w:val="1"/>
+                <w:bCs w:val="1"/>
+                <w:rtl w:val="0"/>
+              </w:rPr>
+              <w:t xml:space="preserve">Elemento</w:t>
+            </w:r>
+            <w:r>
+              <w:rPr>
+                <w:rtl w:val="0"/>
+              </w:rPr>
+            </w:r>
+          </w:p>
+        </w:tc>
+        <w:tc>
+          <w:tcPr/>
+          <w:p>
+            <w:pPr>
+              <w:spacing w:after="60" w:line="300" w:lineRule="auto"/>
+              <w:jc w:val="left"/>
+              <w:rPr/>
+            </w:pPr>
+            <w:r>
+              <w:rPr>
+                <w:b w:val="1"/>
+                <w:bCs w:val="1"/>
+                <w:rtl w:val="0"/>
+              </w:rPr>
+              <w:t xml:space="preserve">Função</w:t>
+            </w:r>
+            <w:r>
+              <w:rPr>
+                <w:rtl w:val="0"/>
+              </w:rPr>
+            </w:r>
+          </w:p>
+        </w:tc>
+        <w:tc>
+          <w:tcPr/>
+          <w:p>
+            <w:pPr>
+              <w:spacing w:after="60" w:line="300" w:lineRule="auto"/>
+              <w:jc w:val="left"/>
+              <w:rPr/>
+            </w:pPr>
+            <w:r>
+              <w:rPr>
+                <w:b w:val="1"/>
+                <w:bCs w:val="1"/>
+                <w:rtl w:val="0"/>
+              </w:rPr>
+              <w:t xml:space="preserve">Interação principal</w:t>
+            </w:r>
+            <w:r>
+              <w:rPr>
+                <w:rtl w:val="0"/>
+              </w:rPr>
+            </w:r>
+          </w:p>
+        </w:tc>
+      </w:tr>
+      <w:tr>
+        <w:trPr>
+          <w:cantSplit w:val="0"/>
+          <w:tblHeader w:val="0"/>
+        </w:trPr>
+        <w:tc>
+          <w:tcPr/>
+          <w:p>
+            <w:pPr>
+              <w:spacing w:after="60" w:line="300" w:lineRule="auto"/>
+              <w:jc w:val="left"/>
+              <w:rPr/>
+            </w:pPr>
+            <w:r>
+              <w:rPr>
+                <w:rtl w:val="0"/>
+              </w:rPr>
+              <w:t xml:space="preserve">1</w:t>
+            </w:r>
+          </w:p>
+        </w:tc>
+        <w:tc>
+          <w:tcPr/>
+          <w:p>
+            <w:pPr>
+              <w:spacing w:after="60" w:line="300" w:lineRule="auto"/>
+              <w:ind w:left="0" w:firstLine="0"/>
+              <w:jc w:val="left"/>
+              <w:rPr/>
+            </w:pPr>
+            <w:r>
+              <w:rPr>
+                <w:rtl w:val="0"/>
+              </w:rPr>
+              <w:t xml:space="preserve">Entrada e resolução DNS</w:t>
+            </w:r>
+          </w:p>
+        </w:tc>
+        <w:tc>
+          <w:tcPr/>
+          <w:p>
+            <w:pPr>
+              <w:spacing w:after="60" w:line="300" w:lineRule="auto"/>
+              <w:ind w:left="0" w:firstLine="0"/>
+              <w:jc w:val="left"/>
+              <w:rPr/>
+            </w:pPr>
+            <w:r>
+              <w:rPr>
+                <w:rtl w:val="0"/>
+              </w:rPr>
+              <w:t xml:space="preserve">Receber o acesso externo, resolver o domínio e aplicar filtragem inicial.</w:t>
+            </w:r>
+          </w:p>
+        </w:tc>
+        <w:tc>
+          <w:tcPr/>
+          <w:p>
+            <w:pPr>
+              <w:spacing w:after="60" w:line="300" w:lineRule="auto"/>
+              <w:ind w:left="0" w:firstLine="0"/>
+              <w:jc w:val="left"/>
+              <w:rPr/>
+            </w:pPr>
+            <w:r>
+              <w:rPr>
+                <w:rtl w:val="0"/>
+              </w:rPr>
+              <w:t xml:space="preserve">Route 53 direciona, WAF protege e ALB encaminha para a camada de aplicação.</w:t>
+            </w:r>
+          </w:p>
+        </w:tc>
+      </w:tr>
+      <w:tr>
+        <w:trPr>
+          <w:cantSplit w:val="0"/>
+          <w:tblHeader w:val="0"/>
+        </w:trPr>
+        <w:tc>
+          <w:tcPr/>
+          <w:p>
+            <w:pPr>
+              <w:spacing w:after="60" w:line="300" w:lineRule="auto"/>
+              <w:jc w:val="left"/>
+              <w:rPr/>
+            </w:pPr>
+            <w:r>
+              <w:rPr>
+                <w:rtl w:val="0"/>
+              </w:rPr>
+              <w:t xml:space="preserve">2</w:t>
+            </w:r>
+          </w:p>
+        </w:tc>
+        <w:tc>
+          <w:tcPr/>
+          <w:p>
+            <w:pPr>
+              <w:spacing w:after="60" w:line="300" w:lineRule="auto"/>
+              <w:ind w:left="0" w:firstLine="0"/>
+              <w:jc w:val="left"/>
+              <w:rPr/>
+            </w:pPr>
+            <w:r>
+              <w:rPr>
+                <w:rtl w:val="0"/>
+              </w:rPr>
+              <w:t xml:space="preserve">Camada de aplicação</w:t>
+            </w:r>
+          </w:p>
+        </w:tc>
+        <w:tc>
+          <w:tcPr/>
+          <w:p>
+            <w:pPr>
+              <w:spacing w:after="60" w:line="300" w:lineRule="auto"/>
+              <w:ind w:left="0" w:firstLine="0"/>
+              <w:jc w:val="left"/>
+              <w:rPr/>
+            </w:pPr>
+            <w:r>
+              <w:rPr>
+                <w:rtl w:val="0"/>
+              </w:rPr>
+              <w:t xml:space="preserve">Executar a lógica de negócio e responder as requisições.</w:t>
+            </w:r>
+          </w:p>
+        </w:tc>
+        <w:tc>
+          <w:tcPr/>
+          <w:p>
+            <w:pPr>
+              <w:spacing w:after="60" w:line="300" w:lineRule="auto"/>
+              <w:ind w:left="0" w:firstLine="0"/>
+              <w:jc w:val="left"/>
+              <w:rPr/>
+            </w:pPr>
+            <w:r>
+              <w:rPr>
+                <w:rtl w:val="0"/>
+              </w:rPr>
+              <w:t xml:space="preserve">Instancias EC2 processam o tráfego recebido do ALB e escalam via Auto Scaling Group.</w:t>
+            </w:r>
+          </w:p>
+        </w:tc>
+      </w:tr>
+      <w:tr>
+        <w:trPr>
+          <w:cantSplit w:val="0"/>
+          <w:tblHeader w:val="0"/>
+        </w:trPr>
+        <w:tc>
+          <w:tcPr/>
+          <w:p>
+            <w:pPr>
+              <w:spacing w:after="60" w:line="300" w:lineRule="auto"/>
+              <w:jc w:val="left"/>
+              <w:rPr/>
+            </w:pPr>
+            <w:r>
+              <w:rPr>
+                <w:rtl w:val="0"/>
+              </w:rPr>
+              <w:t xml:space="preserve">3</w:t>
+            </w:r>
+          </w:p>
+        </w:tc>
+        <w:tc>
+          <w:tcPr/>
+          <w:p>
+            <w:pPr>
+              <w:spacing w:after="60" w:line="300" w:lineRule="auto"/>
+              <w:ind w:left="0" w:firstLine="0"/>
+              <w:jc w:val="left"/>
+              <w:rPr/>
+            </w:pPr>
+            <w:r>
+              <w:rPr>
+                <w:rtl w:val="0"/>
+              </w:rPr>
+              <w:t xml:space="preserve">Persistência de dados</w:t>
+            </w:r>
+          </w:p>
+        </w:tc>
+        <w:tc>
+          <w:tcPr/>
+          <w:p>
+            <w:pPr>
+              <w:spacing w:after="60" w:line="300" w:lineRule="auto"/>
+              <w:ind w:left="0" w:firstLine="0"/>
+              <w:jc w:val="left"/>
+              <w:rPr/>
+            </w:pPr>
+            <w:r>
+              <w:rPr>
+                <w:rtl w:val="0"/>
+              </w:rPr>
+              <w:t xml:space="preserve">Armazenar os dados da aplicação com alta disponibilidade.</w:t>
+            </w:r>
+          </w:p>
+        </w:tc>
+        <w:tc>
+          <w:tcPr/>
+          <w:p>
+            <w:pPr>
+              <w:spacing w:after="60" w:line="300" w:lineRule="auto"/>
+              <w:ind w:left="0" w:firstLine="0"/>
+              <w:jc w:val="left"/>
+              <w:rPr/>
+            </w:pPr>
+            <w:r>
+              <w:rPr>
+                <w:rtl w:val="0"/>
+              </w:rPr>
+              <w:t xml:space="preserve">RDS Multi-AZ mantém a base primária e a standby com failover automático.</w:t>
+            </w:r>
+          </w:p>
+        </w:tc>
+      </w:tr>
+      <w:tr>
+        <w:trPr>
+          <w:cantSplit w:val="0"/>
+          <w:tblHeader w:val="0"/>
+        </w:trPr>
+        <w:tc>
+          <w:tcPr/>
+          <w:p>
+            <w:pPr>
+              <w:spacing w:after="60" w:line="300" w:lineRule="auto"/>
+              <w:jc w:val="left"/>
+              <w:rPr/>
+            </w:pPr>
+            <w:r>
+              <w:rPr>
+                <w:rtl w:val="0"/>
+              </w:rPr>
+              <w:t xml:space="preserve">4</w:t>
+            </w:r>
+          </w:p>
+        </w:tc>
+        <w:tc>
+          <w:tcPr/>
+          <w:p>
+            <w:pPr>
+              <w:spacing w:after="60" w:line="300" w:lineRule="auto"/>
+              <w:ind w:left="0" w:firstLine="0"/>
+              <w:jc w:val="left"/>
+              <w:rPr/>
+            </w:pPr>
+            <w:r>
+              <w:rPr>
+                <w:rtl w:val="0"/>
+              </w:rPr>
+              <w:t xml:space="preserve">Observabilidade</w:t>
+            </w:r>
+          </w:p>
+        </w:tc>
+        <w:tc>
+          <w:tcPr/>
+          <w:p>
+            <w:pPr>
+              <w:spacing w:after="60" w:line="300" w:lineRule="auto"/>
+              <w:ind w:left="0" w:firstLine="0"/>
+              <w:jc w:val="left"/>
+              <w:rPr/>
+            </w:pPr>
+            <w:r>
+              <w:rPr>
+                <w:rtl w:val="0"/>
+              </w:rPr>
+              <w:t xml:space="preserve">Concentrar logs, métricas e alarmes operacionais.</w:t>
+            </w:r>
+          </w:p>
+        </w:tc>
+        <w:tc>
+          <w:tcPr/>
+          <w:p>
+            <w:pPr>
+              <w:spacing w:after="60" w:line="300" w:lineRule="auto"/>
+              <w:ind w:left="0" w:firstLine="0"/>
+              <w:jc w:val="left"/>
+              <w:rPr/>
+            </w:pPr>
+            <w:r>
+              <w:rPr>
+                <w:rtl w:val="0"/>
+              </w:rPr>
+              <w:t xml:space="preserve">CloudWatch coleta telemetria de ALB, EC2 e RDS.</w:t>
+            </w:r>
+          </w:p>
+        </w:tc>
+      </w:tr>
+      <w:tr>
+        <w:trPr>
+          <w:cantSplit w:val="0"/>
+          <w:tblHeader w:val="0"/>
+        </w:trPr>
+        <w:tc>
+          <w:tcPr/>
+          <w:p>
+            <w:pPr>
+              <w:spacing w:after="60" w:line="300" w:lineRule="auto"/>
+              <w:jc w:val="left"/>
+              <w:rPr/>
+            </w:pPr>
+            <w:r>
+              <w:rPr>
+                <w:rtl w:val="0"/>
+              </w:rPr>
+              <w:t xml:space="preserve">5</w:t>
+            </w:r>
+          </w:p>
+        </w:tc>
+        <w:tc>
+          <w:tcPr/>
+          <w:p>
+            <w:pPr>
+              <w:spacing w:after="60" w:line="300" w:lineRule="auto"/>
+              <w:ind w:left="0" w:firstLine="0"/>
+              <w:jc w:val="left"/>
+              <w:rPr/>
+            </w:pPr>
+            <w:r>
+              <w:rPr>
+                <w:rtl w:val="0"/>
+              </w:rPr>
+              <w:t xml:space="preserve">Backup e recuperação</w:t>
+            </w:r>
+          </w:p>
+        </w:tc>
+        <w:tc>
+          <w:tcPr/>
+          <w:p>
+            <w:pPr>
+              <w:spacing w:after="60" w:line="300" w:lineRule="auto"/>
+              <w:ind w:left="0" w:firstLine="0"/>
+              <w:jc w:val="left"/>
+              <w:rPr/>
+            </w:pPr>
+            <w:r>
+              <w:rPr>
+                <w:rtl w:val="0"/>
+              </w:rPr>
+              <w:t xml:space="preserve">Garantir backup e restauração em cenários de falha.</w:t>
+            </w:r>
+          </w:p>
+        </w:tc>
+        <w:tc>
+          <w:tcPr/>
+          <w:p>
+            <w:pPr>
+              <w:spacing w:after="60" w:line="300" w:lineRule="auto"/>
+              <w:ind w:left="0" w:firstLine="0"/>
+              <w:jc w:val="left"/>
+              <w:rPr/>
+            </w:pPr>
+            <w:r>
+              <w:rPr>
+                <w:rtl w:val="0"/>
+              </w:rPr>
+              <w:t xml:space="preserve">AWS Backup protege snapshots e apoia a estratégia de DR.</w:t>
+            </w:r>
+          </w:p>
+        </w:tc>
+      </w:tr>
+      <w:tr>
+        <w:trPr>
+          <w:cantSplit w:val="0"/>
+          <w:tblHeader w:val="0"/>
+        </w:trPr>
+        <w:tc>
+          <w:tcPr/>
+          <w:p>
+            <w:pPr>
+              <w:spacing w:after="60" w:line="300" w:lineRule="auto"/>
+              <w:jc w:val="left"/>
+              <w:rPr/>
+            </w:pPr>
+            <w:r>
+              <w:rPr>
+                <w:rtl w:val="0"/>
+              </w:rPr>
+              <w:t xml:space="preserve">6</w:t>
+            </w:r>
+          </w:p>
+        </w:tc>
+        <w:tc>
+          <w:tcPr/>
+          <w:p>
+            <w:pPr>
+              <w:spacing w:after="60" w:line="300" w:lineRule="auto"/>
+              <w:ind w:left="0" w:firstLine="0"/>
+              <w:jc w:val="left"/>
+              <w:rPr/>
+            </w:pPr>
+            <w:r>
+              <w:rPr>
+                <w:rtl w:val="0"/>
+              </w:rPr>
+              <w:t xml:space="preserve">Controle de acesso</w:t>
+            </w:r>
+          </w:p>
+        </w:tc>
+        <w:tc>
+          <w:tcPr/>
+          <w:p>
+            <w:pPr>
+              <w:spacing w:after="60" w:line="300" w:lineRule="auto"/>
+              <w:ind w:left="0" w:firstLine="0"/>
+              <w:jc w:val="left"/>
+              <w:rPr/>
+            </w:pPr>
+            <w:r>
+              <w:rPr>
+                <w:rtl w:val="0"/>
+              </w:rPr>
+              <w:t xml:space="preserve">Aplicar autorização e menor privilégio entre serviços.</w:t>
+            </w:r>
+          </w:p>
+        </w:tc>
+        <w:tc>
+          <w:tcPr/>
+          <w:p>
+            <w:pPr>
+              <w:spacing w:after="60" w:line="300" w:lineRule="auto"/>
+              <w:ind w:left="0" w:firstLine="0"/>
+              <w:jc w:val="left"/>
+              <w:rPr/>
+            </w:pPr>
+            <w:r>
+              <w:rPr>
+                <w:rtl w:val="0"/>
+              </w:rPr>
+              <w:t xml:space="preserve">IAM Roles e Policies controlam o acesso da aplicação aos recursos AWS.</w:t>
+            </w:r>
+          </w:p>
+        </w:tc>
+      </w:tr>
+    </w:tbl>
+    <w:p>
+      <w:pPr>
+        <w:rPr/>
+      </w:pPr>
+      <w:r>
+        <w:rPr>
+          <w:rtl w:val="0"/>
+        </w:rPr>
+      </w:r>
+    </w:p>
+    <w:p>
+      <w:pPr>
+        <w:pStyle w:val="Heading1"/>
+        <w:spacing w:after="180" w:line="360" w:lineRule="auto"/>
+        <w:jc w:val="left"/>
+        <w:rPr/>
+      </w:pPr>
+      <w:r>
+        <w:rPr>
+          <w:b w:val="1"/>
+          <w:bCs w:val="1"/>
+          <w:rtl w:val="0"/>
+        </w:rPr>
+        <w:t xml:space="preserve">Tabela-resumo do C3</w:t>
+      </w:r>
+      <w:r>
+        <w:rPr>
+          <w:rtl w:val="0"/>
+        </w:rPr>
+      </w:r>
+    </w:p>
+    <w:tbl>
+      <w:tblPr>
+        <w:tblStyle w:val="Table2"/>
+        <w:tblW w:w="10200.0" w:type="dxa"/>
+        <w:jc w:val="left"/>
+        <w:tblInd w:w="-115.0" w:type="dxa"/>
+        <w:tblBorders>
+          <w:top w:color="000000" w:space="0" w:sz="8" w:val="single"/>
+          <w:left w:color="000000" w:space="0" w:sz="8" w:val="single"/>
+          <w:bottom w:color="000000" w:space="0" w:sz="8" w:val="single"/>
+          <w:right w:color="000000" w:space="0" w:sz="8" w:val="single"/>
+          <w:insideH w:color="000000" w:space="0" w:sz="8" w:val="single"/>
+          <w:insideV w:color="000000" w:space="0" w:sz="8" w:val="single"/>
+        </w:tblBorders>
+        <w:tblLayout w:type="fixed"/>
+        <w:tblLook w:val="0400"/>
+      </w:tblPr>
+      <w:tblGrid>
+        <w:gridCol w:w="1100"/>
+        <w:gridCol w:w="2400"/>
+        <w:gridCol w:w="3200"/>
+        <w:gridCol w:w="3500"/>
+        <w:tblGridChange w:id="0">
+          <w:tblGrid>
+            <w:gridCol w:w="1100"/>
+            <w:gridCol w:w="2400"/>
+            <w:gridCol w:w="3200"/>
+            <w:gridCol w:w="3500"/>
+          </w:tblGrid>
+        </w:tblGridChange>
+      </w:tblGrid>
+      <w:tr>
+        <w:trPr>
+          <w:cantSplit w:val="0"/>
+          <w:tblHeader w:val="0"/>
+        </w:trPr>
+        <w:tc>
+          <w:tcPr/>
+          <w:p>
+            <w:pPr>
+              <w:spacing w:after="60" w:line="300" w:lineRule="auto"/>
+              <w:ind w:left="0" w:firstLine="0"/>
+              <w:jc w:val="left"/>
+              <w:rPr/>
+            </w:pPr>
+            <w:r>
+              <w:rPr>
+                <w:b w:val="1"/>
+                <w:bCs w:val="1"/>
+                <w:rtl w:val="0"/>
+              </w:rPr>
+              <w:t xml:space="preserve">Bloco</w:t>
+            </w:r>
+            <w:r>
+              <w:rPr>
+                <w:rtl w:val="0"/>
+              </w:rPr>
+            </w:r>
+          </w:p>
+        </w:tc>
+        <w:tc>
+          <w:tcPr/>
+          <w:p>
+            <w:pPr>
+              <w:spacing w:after="60" w:line="300" w:lineRule="auto"/>
+              <w:jc w:val="left"/>
+              <w:rPr/>
+            </w:pPr>
+            <w:r>
+              <w:rPr>
+                <w:b w:val="1"/>
+                <w:bCs w:val="1"/>
+                <w:rtl w:val="0"/>
+              </w:rPr>
+              <w:t xml:space="preserve">Componente</w:t>
+            </w:r>
+            <w:r>
+              <w:rPr>
+                <w:rtl w:val="0"/>
+              </w:rPr>
+            </w:r>
+          </w:p>
+        </w:tc>
+        <w:tc>
+          <w:tcPr/>
+          <w:p>
+            <w:pPr>
+              <w:spacing w:after="60" w:line="300" w:lineRule="auto"/>
+              <w:jc w:val="left"/>
+              <w:rPr/>
+            </w:pPr>
+            <w:r>
+              <w:rPr>
+                <w:b w:val="1"/>
+                <w:bCs w:val="1"/>
+                <w:rtl w:val="0"/>
+              </w:rPr>
+              <w:t xml:space="preserve">Função</w:t>
+            </w:r>
+            <w:r>
+              <w:rPr>
+                <w:rtl w:val="0"/>
+              </w:rPr>
+            </w:r>
+          </w:p>
+        </w:tc>
+        <w:tc>
+          <w:tcPr/>
+          <w:p>
+            <w:pPr>
+              <w:spacing w:after="60" w:line="300" w:lineRule="auto"/>
+              <w:jc w:val="left"/>
+              <w:rPr/>
+            </w:pPr>
+            <w:r>
+              <w:rPr>
+                <w:b w:val="1"/>
+                <w:bCs w:val="1"/>
+                <w:rtl w:val="0"/>
+              </w:rPr>
+              <w:t xml:space="preserve">Interação principal</w:t>
+            </w:r>
+            <w:r>
+              <w:rPr>
+                <w:rtl w:val="0"/>
+              </w:rPr>
+            </w:r>
+          </w:p>
+        </w:tc>
+      </w:tr>
+      <w:tr>
+        <w:trPr>
+          <w:cantSplit w:val="0"/>
+          <w:tblHeader w:val="0"/>
+        </w:trPr>
+        <w:tc>
+          <w:tcPr/>
+          <w:p>
+            <w:pPr>
+              <w:spacing w:after="60" w:line="300" w:lineRule="auto"/>
+              <w:jc w:val="left"/>
+              <w:rPr/>
+            </w:pPr>
+            <w:r>
+              <w:rPr>
+                <w:rtl w:val="0"/>
+              </w:rPr>
+              <w:t xml:space="preserve">1</w:t>
+            </w:r>
+          </w:p>
+        </w:tc>
+        <w:tc>
+          <w:tcPr/>
+          <w:p>
+            <w:pPr>
+              <w:spacing w:after="60" w:line="300" w:lineRule="auto"/>
+              <w:ind w:left="0" w:firstLine="0"/>
+              <w:jc w:val="left"/>
+              <w:rPr/>
+            </w:pPr>
+            <w:r>
+              <w:rPr>
+                <w:rtl w:val="0"/>
+              </w:rPr>
+              <w:t xml:space="preserve">Balanceamento e entrada</w:t>
+            </w:r>
+          </w:p>
+        </w:tc>
+        <w:tc>
+          <w:tcPr/>
+          <w:p>
+            <w:pPr>
+              <w:spacing w:after="60" w:line="300" w:lineRule="auto"/>
+              <w:ind w:left="0" w:firstLine="0"/>
+              <w:jc w:val="left"/>
+              <w:rPr/>
+            </w:pPr>
+            <w:r>
+              <w:rPr>
+                <w:rtl w:val="0"/>
+              </w:rPr>
+              <w:t xml:space="preserve">Receber tráfego e encaminhar requisições apenas para alvos saudáveis.</w:t>
+            </w:r>
+          </w:p>
+        </w:tc>
+        <w:tc>
+          <w:tcPr/>
+          <w:p>
+            <w:pPr>
+              <w:spacing w:after="60" w:line="300" w:lineRule="auto"/>
+              <w:ind w:left="0" w:firstLine="0"/>
+              <w:jc w:val="left"/>
+              <w:rPr/>
+            </w:pPr>
+            <w:r>
+              <w:rPr>
+                <w:rtl w:val="0"/>
+              </w:rPr>
+              <w:t xml:space="preserve">ALB distribui o tráfego com base em health checks.</w:t>
+            </w:r>
+          </w:p>
+        </w:tc>
+      </w:tr>
+      <w:tr>
+        <w:trPr>
+          <w:cantSplit w:val="0"/>
+          <w:tblHeader w:val="0"/>
+        </w:trPr>
+        <w:tc>
+          <w:tcPr/>
+          <w:p>
+            <w:pPr>
+              <w:spacing w:after="60" w:line="300" w:lineRule="auto"/>
+              <w:jc w:val="left"/>
+              <w:rPr/>
+            </w:pPr>
+            <w:r>
+              <w:rPr>
+                <w:rtl w:val="0"/>
+              </w:rPr>
+              <w:t xml:space="preserve">2</w:t>
+            </w:r>
+          </w:p>
+        </w:tc>
+        <w:tc>
+          <w:tcPr/>
+          <w:p>
+            <w:pPr>
+              <w:spacing w:after="60" w:line="300" w:lineRule="auto"/>
+              <w:ind w:left="0" w:firstLine="0"/>
+              <w:jc w:val="left"/>
+              <w:rPr/>
+            </w:pPr>
+            <w:r>
+              <w:rPr>
+                <w:rtl w:val="0"/>
+              </w:rPr>
+              <w:t xml:space="preserve">Camada web</w:t>
+            </w:r>
+          </w:p>
+        </w:tc>
+        <w:tc>
+          <w:tcPr/>
+          <w:p>
+            <w:pPr>
+              <w:spacing w:after="60" w:line="300" w:lineRule="auto"/>
+              <w:ind w:left="0" w:firstLine="0"/>
+              <w:jc w:val="left"/>
+              <w:rPr/>
+            </w:pPr>
+            <w:r>
+              <w:rPr>
+                <w:rtl w:val="0"/>
+              </w:rPr>
+              <w:t xml:space="preserve">Receber HTTP/HTTPS e encaminhar para a API.</w:t>
+            </w:r>
+          </w:p>
+        </w:tc>
+        <w:tc>
+          <w:tcPr/>
+          <w:p>
+            <w:pPr>
+              <w:spacing w:after="60" w:line="300" w:lineRule="auto"/>
+              <w:ind w:left="0" w:firstLine="0"/>
+              <w:jc w:val="left"/>
+              <w:rPr/>
+            </w:pPr>
+            <w:r>
+              <w:rPr>
+                <w:rtl w:val="0"/>
+              </w:rPr>
+              <w:t xml:space="preserve">Servidor web atua como ponto de entrada da aplicação.</w:t>
+            </w:r>
+          </w:p>
+        </w:tc>
+      </w:tr>
+      <w:tr>
+        <w:trPr>
+          <w:cantSplit w:val="0"/>
+          <w:tblHeader w:val="0"/>
+        </w:trPr>
+        <w:tc>
+          <w:tcPr/>
+          <w:p>
+            <w:pPr>
+              <w:spacing w:after="60" w:line="300" w:lineRule="auto"/>
+              <w:jc w:val="left"/>
+              <w:rPr/>
+            </w:pPr>
+            <w:r>
+              <w:rPr>
+                <w:rtl w:val="0"/>
+              </w:rPr>
+              <w:t xml:space="preserve">3</w:t>
+            </w:r>
+          </w:p>
+        </w:tc>
+        <w:tc>
+          <w:tcPr/>
+          <w:p>
+            <w:pPr>
+              <w:spacing w:after="60" w:line="300" w:lineRule="auto"/>
+              <w:jc w:val="left"/>
+              <w:rPr/>
+            </w:pPr>
+            <w:r>
+              <w:rPr>
+                <w:rtl w:val="0"/>
+              </w:rPr>
+              <w:t xml:space="preserve">API da aplicação</w:t>
+            </w:r>
+          </w:p>
+        </w:tc>
+        <w:tc>
+          <w:tcPr/>
+          <w:p>
+            <w:pPr>
+              <w:spacing w:after="60" w:line="300" w:lineRule="auto"/>
+              <w:jc w:val="left"/>
+              <w:rPr/>
+            </w:pPr>
+            <w:r>
+              <w:rPr>
+                <w:rtl w:val="0"/>
+              </w:rPr>
+              <w:t xml:space="preserve">Centralizar regras de negócio e orquestrar módulos internos.</w:t>
+            </w:r>
+          </w:p>
+        </w:tc>
+        <w:tc>
+          <w:tcPr/>
+          <w:p>
+            <w:pPr>
+              <w:spacing w:after="60" w:line="300" w:lineRule="auto"/>
+              <w:jc w:val="left"/>
+              <w:rPr/>
+            </w:pPr>
+            <w:r>
+              <w:rPr>
+                <w:rtl w:val="0"/>
+              </w:rPr>
+              <w:t xml:space="preserve">API aciona autenticacao, catalogo, checkout e persistência.</w:t>
+            </w:r>
+          </w:p>
+        </w:tc>
+      </w:tr>
+      <w:tr>
+        <w:trPr>
+          <w:cantSplit w:val="0"/>
+          <w:tblHeader w:val="0"/>
+        </w:trPr>
+        <w:tc>
+          <w:tcPr/>
+          <w:p>
+            <w:pPr>
+              <w:spacing w:after="60" w:line="300" w:lineRule="auto"/>
+              <w:jc w:val="left"/>
+              <w:rPr/>
+            </w:pPr>
+            <w:r>
+              <w:rPr>
+                <w:rtl w:val="0"/>
+              </w:rPr>
+              <w:t xml:space="preserve">4</w:t>
+            </w:r>
+          </w:p>
+        </w:tc>
+        <w:tc>
+          <w:tcPr/>
+          <w:p>
+            <w:pPr>
+              <w:spacing w:after="60" w:line="300" w:lineRule="auto"/>
+              <w:jc w:val="left"/>
+              <w:rPr/>
+            </w:pPr>
+            <w:r>
+              <w:rPr>
+                <w:rtl w:val="0"/>
+              </w:rPr>
+              <w:t xml:space="preserve">Autenticação e autorização</w:t>
+            </w:r>
+          </w:p>
+        </w:tc>
+        <w:tc>
+          <w:tcPr/>
+          <w:p>
+            <w:pPr>
+              <w:spacing w:after="60" w:line="300" w:lineRule="auto"/>
+              <w:jc w:val="left"/>
+              <w:rPr/>
+            </w:pPr>
+            <w:r>
+              <w:rPr>
+                <w:rtl w:val="0"/>
+              </w:rPr>
+              <w:t xml:space="preserve">Validar identidades e aplicar regras de acesso.</w:t>
+            </w:r>
+          </w:p>
+        </w:tc>
+        <w:tc>
+          <w:tcPr/>
+          <w:p>
+            <w:pPr>
+              <w:spacing w:after="60" w:line="300" w:lineRule="auto"/>
+              <w:jc w:val="left"/>
+              <w:rPr/>
+            </w:pPr>
+            <w:r>
+              <w:rPr>
+                <w:rtl w:val="0"/>
+              </w:rPr>
+              <w:t xml:space="preserve">Controla permissão de uso dos recursos da aplicação.</w:t>
+            </w:r>
+          </w:p>
+        </w:tc>
+      </w:tr>
+      <w:tr>
+        <w:trPr>
+          <w:cantSplit w:val="0"/>
+          <w:tblHeader w:val="0"/>
+        </w:trPr>
+        <w:tc>
+          <w:tcPr/>
+          <w:p>
+            <w:pPr>
+              <w:spacing w:after="60" w:line="300" w:lineRule="auto"/>
+              <w:jc w:val="left"/>
+              <w:rPr/>
+            </w:pPr>
+            <w:r>
+              <w:rPr>
+                <w:rtl w:val="0"/>
+              </w:rPr>
+              <w:t xml:space="preserve">5</w:t>
+            </w:r>
+          </w:p>
+        </w:tc>
+        <w:tc>
+          <w:tcPr/>
+          <w:p>
+            <w:pPr>
+              <w:spacing w:after="60" w:line="300" w:lineRule="auto"/>
+              <w:jc w:val="left"/>
+              <w:rPr/>
+            </w:pPr>
+            <w:r>
+              <w:rPr>
+                <w:rtl w:val="0"/>
+              </w:rPr>
+              <w:t xml:space="preserve">Catálogo de produtos</w:t>
+            </w:r>
+          </w:p>
+        </w:tc>
+        <w:tc>
+          <w:tcPr/>
+          <w:p>
+            <w:pPr>
+              <w:spacing w:after="60" w:line="300" w:lineRule="auto"/>
+              <w:jc w:val="left"/>
+              <w:rPr/>
+            </w:pPr>
+            <w:r>
+              <w:rPr>
+                <w:rtl w:val="0"/>
+              </w:rPr>
+              <w:t xml:space="preserve">Expor informações de produtos e apoiar consultas.</w:t>
+            </w:r>
+          </w:p>
+        </w:tc>
+        <w:tc>
+          <w:tcPr/>
+          <w:p>
+            <w:pPr>
+              <w:spacing w:after="60" w:line="300" w:lineRule="auto"/>
+              <w:jc w:val="left"/>
+              <w:rPr/>
+            </w:pPr>
+            <w:r>
+              <w:rPr>
+                <w:rtl w:val="0"/>
+              </w:rPr>
+              <w:t xml:space="preserve">Atende navegação e busca de itens no sistema.</w:t>
+            </w:r>
+          </w:p>
+        </w:tc>
+      </w:tr>
+      <w:tr>
+        <w:trPr>
+          <w:cantSplit w:val="0"/>
+          <w:tblHeader w:val="0"/>
+        </w:trPr>
+        <w:tc>
+          <w:tcPr/>
+          <w:p>
+            <w:pPr>
+              <w:spacing w:after="60" w:line="300" w:lineRule="auto"/>
+              <w:jc w:val="left"/>
+              <w:rPr/>
+            </w:pPr>
+            <w:r>
+              <w:rPr>
+                <w:rtl w:val="0"/>
+              </w:rPr>
+              <w:t xml:space="preserve">6</w:t>
+            </w:r>
+          </w:p>
+        </w:tc>
+        <w:tc>
+          <w:tcPr/>
+          <w:p>
+            <w:pPr>
+              <w:spacing w:after="60" w:line="300" w:lineRule="auto"/>
+              <w:jc w:val="left"/>
+              <w:rPr/>
+            </w:pPr>
+            <w:r>
+              <w:rPr>
+                <w:rtl w:val="0"/>
+              </w:rPr>
+              <w:t xml:space="preserve">Carrinho e check out</w:t>
+            </w:r>
+          </w:p>
+        </w:tc>
+        <w:tc>
+          <w:tcPr/>
+          <w:p>
+            <w:pPr>
+              <w:spacing w:after="60" w:line="300" w:lineRule="auto"/>
+              <w:jc w:val="left"/>
+              <w:rPr/>
+            </w:pPr>
+            <w:r>
+              <w:rPr>
+                <w:rtl w:val="0"/>
+              </w:rPr>
+              <w:t xml:space="preserve">Concentrar a lógica de compra e fechamento.</w:t>
+            </w:r>
+          </w:p>
+        </w:tc>
+        <w:tc>
+          <w:tcPr/>
+          <w:p>
+            <w:pPr>
+              <w:spacing w:after="60" w:line="300" w:lineRule="auto"/>
+              <w:jc w:val="left"/>
+              <w:rPr/>
+            </w:pPr>
+            <w:r>
+              <w:rPr>
+                <w:rtl w:val="0"/>
+              </w:rPr>
+              <w:t xml:space="preserve">Recebe itens selecionados, calcula etapas e conclui a compra.</w:t>
+            </w:r>
+          </w:p>
+        </w:tc>
+      </w:tr>
+      <w:tr>
+        <w:trPr>
+          <w:cantSplit w:val="0"/>
+          <w:tblHeader w:val="0"/>
+        </w:trPr>
+        <w:tc>
+          <w:tcPr/>
+          <w:p>
+            <w:pPr>
+              <w:spacing w:after="60" w:line="300" w:lineRule="auto"/>
+              <w:jc w:val="left"/>
+              <w:rPr/>
+            </w:pPr>
+            <w:r>
+              <w:rPr>
+                <w:rtl w:val="0"/>
+              </w:rPr>
+              <w:t xml:space="preserve">7</w:t>
+            </w:r>
+          </w:p>
+        </w:tc>
+        <w:tc>
+          <w:tcPr/>
+          <w:p>
+            <w:pPr>
+              <w:spacing w:after="60" w:line="300" w:lineRule="auto"/>
+              <w:jc w:val="left"/>
+              <w:rPr/>
+            </w:pPr>
+            <w:r>
+              <w:rPr>
+                <w:rtl w:val="0"/>
+              </w:rPr>
+              <w:t xml:space="preserve">Pedidos e confirmação</w:t>
+            </w:r>
+          </w:p>
+        </w:tc>
+        <w:tc>
+          <w:tcPr/>
+          <w:p>
+            <w:pPr>
+              <w:spacing w:after="60" w:line="300" w:lineRule="auto"/>
+              <w:jc w:val="left"/>
+              <w:rPr/>
+            </w:pPr>
+            <w:r>
+              <w:rPr>
+                <w:rtl w:val="0"/>
+              </w:rPr>
+              <w:t xml:space="preserve">Registrar pedidos e acompanhar a confirmação.</w:t>
+            </w:r>
+          </w:p>
+        </w:tc>
+        <w:tc>
+          <w:tcPr/>
+          <w:p>
+            <w:pPr>
+              <w:spacing w:after="60" w:line="300" w:lineRule="auto"/>
+              <w:jc w:val="left"/>
+              <w:rPr/>
+            </w:pPr>
+            <w:r>
+              <w:rPr>
+                <w:rtl w:val="0"/>
+              </w:rPr>
+              <w:t xml:space="preserve">Persiste o resultado final do processo de compra.</w:t>
+            </w:r>
+          </w:p>
+        </w:tc>
+      </w:tr>
+      <w:tr>
+        <w:trPr>
+          <w:cantSplit w:val="0"/>
+          <w:tblHeader w:val="0"/>
+        </w:trPr>
+        <w:tc>
+          <w:tcPr/>
+          <w:p>
+            <w:pPr>
+              <w:spacing w:after="60" w:line="300" w:lineRule="auto"/>
+              <w:jc w:val="left"/>
+              <w:rPr/>
+            </w:pPr>
+            <w:r>
+              <w:rPr>
+                <w:rtl w:val="0"/>
+              </w:rPr>
+              <w:t xml:space="preserve">8</w:t>
+            </w:r>
+          </w:p>
+        </w:tc>
+        <w:tc>
+          <w:tcPr/>
+          <w:p>
+            <w:pPr>
+              <w:spacing w:after="60" w:line="300" w:lineRule="auto"/>
+              <w:jc w:val="left"/>
+              <w:rPr/>
+            </w:pPr>
+            <w:r>
+              <w:rPr>
+                <w:rtl w:val="0"/>
+              </w:rPr>
+              <w:t xml:space="preserve">Camada de persistência</w:t>
+            </w:r>
+          </w:p>
+        </w:tc>
+        <w:tc>
+          <w:tcPr/>
+          <w:p>
+            <w:pPr>
+              <w:spacing w:after="60" w:line="300" w:lineRule="auto"/>
+              <w:jc w:val="left"/>
+              <w:rPr/>
+            </w:pPr>
+            <w:r>
+              <w:rPr>
+                <w:rtl w:val="0"/>
+              </w:rPr>
+              <w:t xml:space="preserve">Encapsular leitura e escrita no banco.</w:t>
+            </w:r>
+          </w:p>
+        </w:tc>
+        <w:tc>
+          <w:tcPr/>
+          <w:p>
+            <w:pPr>
+              <w:spacing w:after="60" w:line="300" w:lineRule="auto"/>
+              <w:jc w:val="left"/>
+              <w:rPr/>
+            </w:pPr>
+            <w:r>
+              <w:rPr>
+                <w:rtl w:val="0"/>
+              </w:rPr>
+              <w:t xml:space="preserve">Repository/DAO isola a aplicação da tecnologia de dados.</w:t>
+            </w:r>
+          </w:p>
+        </w:tc>
+      </w:tr>
+      <w:tr>
+        <w:trPr>
+          <w:cantSplit w:val="0"/>
+          <w:tblHeader w:val="0"/>
+        </w:trPr>
+        <w:tc>
+          <w:tcPr/>
+          <w:p>
+            <w:pPr>
+              <w:spacing w:after="60" w:line="300" w:lineRule="auto"/>
+              <w:jc w:val="left"/>
+              <w:rPr/>
+            </w:pPr>
+            <w:r>
+              <w:rPr>
+                <w:rtl w:val="0"/>
+              </w:rPr>
+              <w:t xml:space="preserve">9</w:t>
+            </w:r>
+          </w:p>
+        </w:tc>
+        <w:tc>
+          <w:tcPr/>
+          <w:p>
+            <w:pPr>
+              <w:spacing w:after="60" w:line="300" w:lineRule="auto"/>
+              <w:jc w:val="left"/>
+              <w:rPr/>
+            </w:pPr>
+            <w:r>
+              <w:rPr>
+                <w:rtl w:val="0"/>
+              </w:rPr>
+              <w:t xml:space="preserve">Observabilidade</w:t>
+            </w:r>
+          </w:p>
+        </w:tc>
+        <w:tc>
+          <w:tcPr/>
+          <w:p>
+            <w:pPr>
+              <w:spacing w:after="60" w:line="300" w:lineRule="auto"/>
+              <w:jc w:val="left"/>
+              <w:rPr/>
+            </w:pPr>
+            <w:r>
+              <w:rPr>
+                <w:rtl w:val="0"/>
+              </w:rPr>
+              <w:t xml:space="preserve">Gerar logs e métricas da aplicação.</w:t>
+            </w:r>
+          </w:p>
+        </w:tc>
+        <w:tc>
+          <w:tcPr/>
+          <w:p>
+            <w:pPr>
+              <w:spacing w:after="60" w:line="300" w:lineRule="auto"/>
+              <w:jc w:val="left"/>
+              <w:rPr/>
+            </w:pPr>
+            <w:r>
+              <w:rPr>
+                <w:rtl w:val="0"/>
+              </w:rPr>
+              <w:t xml:space="preserve">Fornece visibilidade operacional para monitoramento e diagnóstico.</w:t>
+            </w:r>
+          </w:p>
+        </w:tc>
+      </w:tr>
+    </w:tbl>
+    <w:p>
+      <w:pPr>
+        <w:rPr/>
+      </w:pPr>
+      <w:r>
+        <w:rPr>
+          <w:rtl w:val="0"/>
+        </w:rPr>
+      </w:r>
+    </w:p>
+    <w:p>
+      <w:pPr>
+        <w:pStyle w:val="Heading1"/>
+        <w:spacing w:after="180" w:line="360" w:lineRule="auto"/>
+        <w:jc w:val="left"/>
+        <w:rPr/>
+      </w:pPr>
+      <w:r>
+        <w:rPr>
+          <w:b w:val="1"/>
+          <w:bCs w:val="1"/>
+          <w:rtl w:val="0"/>
+        </w:rPr>
+        <w:t xml:space="preserve">Fluxo da </w:t>
+      </w:r>
+      <w:r>
+        <w:rPr>
+          <w:rtl w:val="0"/>
+        </w:rPr>
+        <w:t xml:space="preserve">Solução</w:t>
+      </w:r>
+    </w:p>
+    <w:p>
+      <w:pPr>
+        <w:spacing w:after="120" w:line="360" w:lineRule="auto"/>
+        <w:ind w:firstLine="709"/>
+        <w:jc w:val="both"/>
+        <w:rPr/>
+      </w:pPr>
+      <w:r>
+        <w:rPr>
+          <w:rtl w:val="0"/>
+        </w:rPr>
+        <w:t xml:space="preserve">O fluxo resumido da requisição reforça a leitura conjunta do C2 e do C3.</w:t>
+      </w:r>
+    </w:p>
+    <w:p>
+      <w:pPr>
+        <w:keepNext w:val="0"/>
+        <w:keepLines w:val="0"/>
+        <w:pageBreakBefore w:val="0"/>
+        <w:widowControl w:val="1"/>
+        <w:pBdr>
+          <w:top w:space="0" w:sz="0" w:val="nil"/>
+          <w:left w:space="0" w:sz="0" w:val="nil"/>
+          <w:bottom w:space="0" w:sz="0" w:val="nil"/>
+          <w:right w:space="0" w:sz="0" w:val="nil"/>
+          <w:between w:space="0" w:sz="0" w:val="nil"/>
+        </w:pBdr>
+        <w:shd w:fill="auto" w:val="clear"/>
+        <w:spacing w:after="60" w:before="0" w:line="360" w:lineRule="auto"/>
+        <w:ind w:left="360" w:right="0" w:firstLine="0"/>
+        <w:jc w:val="left"/>
+        <w:rPr>
+          <w:rFonts w:ascii="Times New Roman" w:cs="Times New Roman" w:eastAsia="Times New Roman" w:hAnsi="Times New Roman"/>
+          <w:b w:val="0"/>
+          <w:bCs w:val="0"/>
+          <w:i w:val="0"/>
+          <w:iCs w:val="0"/>
+          <w:smallCaps w:val="0"/>
+          <w:strike w:val="0"/>
+          <w:color w:val="000000"/>
+          <w:sz w:val="24"/>
+          <w:szCs w:val="24"/>
+          <w:u w:val="none"/>
+          <w:shd w:fill="auto" w:val="clear"/>
+          <w:vertAlign w:val="baseline"/>
+        </w:rPr>
+      </w:pPr>
+      <w:r>
+        <w:rPr>
+          <w:rFonts w:ascii="Times New Roman" w:cs="Times New Roman" w:eastAsia="Times New Roman" w:hAnsi="Times New Roman"/>
+          <w:b w:val="0"/>
+          <w:bCs w:val="0"/>
+          <w:i w:val="0"/>
+          <w:iCs w:val="0"/>
+          <w:smallCaps w:val="0"/>
+          <w:strike w:val="0"/>
+          <w:color w:val="000000"/>
+          <w:sz w:val="24"/>
+          <w:szCs w:val="24"/>
+          <w:u w:val="none"/>
+          <w:shd w:fill="auto" w:val="clear"/>
+          <w:vertAlign w:val="baseline"/>
+          <w:rtl w:val="0"/>
+        </w:rPr>
+        <w:t xml:space="preserve">1. O </w:t>
+      </w:r>
+      <w:r>
+        <w:rPr>
+          <w:rtl w:val="0"/>
+        </w:rPr>
+        <w:t xml:space="preserve">usuário</w:t>
+      </w:r>
+      <w:r>
+        <w:rPr>
+          <w:rFonts w:ascii="Times New Roman" w:cs="Times New Roman" w:eastAsia="Times New Roman" w:hAnsi="Times New Roman"/>
+          <w:b w:val="0"/>
+          <w:bCs w:val="0"/>
+          <w:i w:val="0"/>
+          <w:iCs w:val="0"/>
+          <w:smallCaps w:val="0"/>
+          <w:strike w:val="0"/>
+          <w:color w:val="000000"/>
+          <w:sz w:val="24"/>
+          <w:szCs w:val="24"/>
+          <w:u w:val="none"/>
+          <w:shd w:fill="auto" w:val="clear"/>
+          <w:vertAlign w:val="baseline"/>
+          <w:rtl w:val="0"/>
+        </w:rPr>
+        <w:t xml:space="preserve"> acessa a </w:t>
+      </w:r>
+      <w:r>
+        <w:rPr>
+          <w:rtl w:val="0"/>
+        </w:rPr>
+        <w:t xml:space="preserve">aplicação</w:t>
+      </w:r>
+      <w:r>
+        <w:rPr>
+          <w:rFonts w:ascii="Times New Roman" w:cs="Times New Roman" w:eastAsia="Times New Roman" w:hAnsi="Times New Roman"/>
+          <w:b w:val="0"/>
+          <w:bCs w:val="0"/>
+          <w:i w:val="0"/>
+          <w:iCs w:val="0"/>
+          <w:smallCaps w:val="0"/>
+          <w:strike w:val="0"/>
+          <w:color w:val="000000"/>
+          <w:sz w:val="24"/>
+          <w:szCs w:val="24"/>
+          <w:u w:val="none"/>
+          <w:shd w:fill="auto" w:val="clear"/>
+          <w:vertAlign w:val="baseline"/>
+          <w:rtl w:val="0"/>
+        </w:rPr>
+        <w:t xml:space="preserve"> pela internet utilizando o </w:t>
+      </w:r>
+      <w:r>
+        <w:rPr>
+          <w:rtl w:val="0"/>
+        </w:rPr>
+        <w:t xml:space="preserve">domínio</w:t>
+      </w:r>
+      <w:r>
+        <w:rPr>
+          <w:rFonts w:ascii="Times New Roman" w:cs="Times New Roman" w:eastAsia="Times New Roman" w:hAnsi="Times New Roman"/>
+          <w:b w:val="0"/>
+          <w:bCs w:val="0"/>
+          <w:i w:val="0"/>
+          <w:iCs w:val="0"/>
+          <w:smallCaps w:val="0"/>
+          <w:strike w:val="0"/>
+          <w:color w:val="000000"/>
+          <w:sz w:val="24"/>
+          <w:szCs w:val="24"/>
+          <w:u w:val="none"/>
+          <w:shd w:fill="auto" w:val="clear"/>
+          <w:vertAlign w:val="baseline"/>
+          <w:rtl w:val="0"/>
+        </w:rPr>
+        <w:t xml:space="preserve"> publicado.</w:t>
+      </w:r>
+    </w:p>
+    <w:p>
+      <w:pPr>
+        <w:keepNext w:val="0"/>
+        <w:keepLines w:val="0"/>
+        <w:pageBreakBefore w:val="0"/>
+        <w:widowControl w:val="1"/>
+        <w:pBdr>
+          <w:top w:space="0" w:sz="0" w:val="nil"/>
+          <w:left w:space="0" w:sz="0" w:val="nil"/>
+          <w:bottom w:space="0" w:sz="0" w:val="nil"/>
+          <w:right w:space="0" w:sz="0" w:val="nil"/>
+          <w:between w:space="0" w:sz="0" w:val="nil"/>
+        </w:pBdr>
+        <w:shd w:fill="auto" w:val="clear"/>
+        <w:spacing w:after="60" w:before="0" w:line="360" w:lineRule="auto"/>
+        <w:ind w:left="360" w:right="0" w:firstLine="0"/>
+        <w:jc w:val="left"/>
+        <w:rPr>
+          <w:rFonts w:ascii="Times New Roman" w:cs="Times New Roman" w:eastAsia="Times New Roman" w:hAnsi="Times New Roman"/>
+          <w:b w:val="0"/>
+          <w:bCs w:val="0"/>
+          <w:i w:val="0"/>
+          <w:iCs w:val="0"/>
+          <w:smallCaps w:val="0"/>
+          <w:strike w:val="0"/>
+          <w:color w:val="000000"/>
+          <w:sz w:val="24"/>
+          <w:szCs w:val="24"/>
+          <w:u w:val="none"/>
+          <w:shd w:fill="auto" w:val="clear"/>
+          <w:vertAlign w:val="baseline"/>
+        </w:rPr>
+      </w:pPr>
+      <w:r>
+        <w:rPr>
+          <w:rFonts w:ascii="Times New Roman" w:cs="Times New Roman" w:eastAsia="Times New Roman" w:hAnsi="Times New Roman"/>
+          <w:b w:val="0"/>
+          <w:bCs w:val="0"/>
+          <w:i w:val="0"/>
+          <w:iCs w:val="0"/>
+          <w:smallCaps w:val="0"/>
+          <w:strike w:val="0"/>
+          <w:color w:val="000000"/>
+          <w:sz w:val="24"/>
+          <w:szCs w:val="24"/>
+          <w:u w:val="none"/>
+          <w:shd w:fill="auto" w:val="clear"/>
+          <w:vertAlign w:val="baseline"/>
+          <w:rtl w:val="0"/>
+        </w:rPr>
+        <w:t xml:space="preserve">2. O Amazon Route 53 resolve o </w:t>
+      </w:r>
+      <w:r>
+        <w:rPr>
+          <w:rtl w:val="0"/>
+        </w:rPr>
+        <w:t xml:space="preserve">domínio</w:t>
+      </w:r>
+      <w:r>
+        <w:rPr>
+          <w:rFonts w:ascii="Times New Roman" w:cs="Times New Roman" w:eastAsia="Times New Roman" w:hAnsi="Times New Roman"/>
+          <w:b w:val="0"/>
+          <w:bCs w:val="0"/>
+          <w:i w:val="0"/>
+          <w:iCs w:val="0"/>
+          <w:smallCaps w:val="0"/>
+          <w:strike w:val="0"/>
+          <w:color w:val="000000"/>
+          <w:sz w:val="24"/>
+          <w:szCs w:val="24"/>
+          <w:u w:val="none"/>
+          <w:shd w:fill="auto" w:val="clear"/>
+          <w:vertAlign w:val="baseline"/>
+          <w:rtl w:val="0"/>
+        </w:rPr>
+        <w:t xml:space="preserve"> e direciona a chamada para a camada de entrada.</w:t>
+      </w:r>
+    </w:p>
+    <w:p>
+      <w:pPr>
+        <w:keepNext w:val="0"/>
+        <w:keepLines w:val="0"/>
+        <w:pageBreakBefore w:val="0"/>
+        <w:widowControl w:val="1"/>
+        <w:pBdr>
+          <w:top w:space="0" w:sz="0" w:val="nil"/>
+          <w:left w:space="0" w:sz="0" w:val="nil"/>
+          <w:bottom w:space="0" w:sz="0" w:val="nil"/>
+          <w:right w:space="0" w:sz="0" w:val="nil"/>
+          <w:between w:space="0" w:sz="0" w:val="nil"/>
+        </w:pBdr>
+        <w:shd w:fill="auto" w:val="clear"/>
+        <w:spacing w:after="60" w:before="0" w:line="360" w:lineRule="auto"/>
+        <w:ind w:left="360" w:right="0" w:firstLine="0"/>
+        <w:jc w:val="left"/>
+        <w:rPr>
+          <w:rFonts w:ascii="Times New Roman" w:cs="Times New Roman" w:eastAsia="Times New Roman" w:hAnsi="Times New Roman"/>
+          <w:b w:val="0"/>
+          <w:bCs w:val="0"/>
+          <w:i w:val="0"/>
+          <w:iCs w:val="0"/>
+          <w:smallCaps w:val="0"/>
+          <w:strike w:val="0"/>
+          <w:color w:val="000000"/>
+          <w:sz w:val="24"/>
+          <w:szCs w:val="24"/>
+          <w:u w:val="none"/>
+          <w:shd w:fill="auto" w:val="clear"/>
+          <w:vertAlign w:val="baseline"/>
+        </w:rPr>
+      </w:pPr>
+      <w:r>
+        <w:rPr>
+          <w:rFonts w:ascii="Times New Roman" w:cs="Times New Roman" w:eastAsia="Times New Roman" w:hAnsi="Times New Roman"/>
+          <w:b w:val="0"/>
+          <w:bCs w:val="0"/>
+          <w:i w:val="0"/>
+          <w:iCs w:val="0"/>
+          <w:smallCaps w:val="0"/>
+          <w:strike w:val="0"/>
+          <w:color w:val="000000"/>
+          <w:sz w:val="24"/>
+          <w:szCs w:val="24"/>
+          <w:u w:val="none"/>
+          <w:shd w:fill="auto" w:val="clear"/>
+          <w:vertAlign w:val="baseline"/>
+          <w:rtl w:val="0"/>
+        </w:rPr>
+        <w:t xml:space="preserve">3. O AWS WAF inspeciona o </w:t>
+      </w:r>
+      <w:r>
+        <w:rPr>
+          <w:rtl w:val="0"/>
+        </w:rPr>
+        <w:t xml:space="preserve">tráfego</w:t>
+      </w:r>
+      <w:r>
+        <w:rPr>
+          <w:rFonts w:ascii="Times New Roman" w:cs="Times New Roman" w:eastAsia="Times New Roman" w:hAnsi="Times New Roman"/>
+          <w:b w:val="0"/>
+          <w:bCs w:val="0"/>
+          <w:i w:val="0"/>
+          <w:iCs w:val="0"/>
+          <w:smallCaps w:val="0"/>
+          <w:strike w:val="0"/>
+          <w:color w:val="000000"/>
+          <w:sz w:val="24"/>
+          <w:szCs w:val="24"/>
+          <w:u w:val="none"/>
+          <w:shd w:fill="auto" w:val="clear"/>
+          <w:vertAlign w:val="baseline"/>
+          <w:rtl w:val="0"/>
+        </w:rPr>
+        <w:t xml:space="preserve"> e bloqueia </w:t>
+      </w:r>
+      <w:r>
+        <w:rPr>
+          <w:rtl w:val="0"/>
+        </w:rPr>
+        <w:t xml:space="preserve">requisições</w:t>
+      </w:r>
+      <w:r>
+        <w:rPr>
+          <w:rFonts w:ascii="Times New Roman" w:cs="Times New Roman" w:eastAsia="Times New Roman" w:hAnsi="Times New Roman"/>
+          <w:b w:val="0"/>
+          <w:bCs w:val="0"/>
+          <w:i w:val="0"/>
+          <w:iCs w:val="0"/>
+          <w:smallCaps w:val="0"/>
+          <w:strike w:val="0"/>
+          <w:color w:val="000000"/>
+          <w:sz w:val="24"/>
+          <w:szCs w:val="24"/>
+          <w:u w:val="none"/>
+          <w:shd w:fill="auto" w:val="clear"/>
+          <w:vertAlign w:val="baseline"/>
+          <w:rtl w:val="0"/>
+        </w:rPr>
+        <w:t xml:space="preserve"> maliciosas ou fora da </w:t>
+      </w:r>
+      <w:r>
+        <w:rPr>
+          <w:rtl w:val="0"/>
+        </w:rPr>
+        <w:t xml:space="preserve">política</w:t>
+      </w:r>
+      <w:r>
+        <w:rPr>
+          <w:rFonts w:ascii="Times New Roman" w:cs="Times New Roman" w:eastAsia="Times New Roman" w:hAnsi="Times New Roman"/>
+          <w:b w:val="0"/>
+          <w:bCs w:val="0"/>
+          <w:i w:val="0"/>
+          <w:iCs w:val="0"/>
+          <w:smallCaps w:val="0"/>
+          <w:strike w:val="0"/>
+          <w:color w:val="000000"/>
+          <w:sz w:val="24"/>
+          <w:szCs w:val="24"/>
+          <w:u w:val="none"/>
+          <w:shd w:fill="auto" w:val="clear"/>
+          <w:vertAlign w:val="baseline"/>
+          <w:rtl w:val="0"/>
+        </w:rPr>
+        <w:t xml:space="preserve">.</w:t>
+      </w:r>
+    </w:p>
+    <w:p>
+      <w:pPr>
+        <w:keepNext w:val="0"/>
+        <w:keepLines w:val="0"/>
+        <w:pageBreakBefore w:val="0"/>
+        <w:widowControl w:val="1"/>
+        <w:pBdr>
+          <w:top w:space="0" w:sz="0" w:val="nil"/>
+          <w:left w:space="0" w:sz="0" w:val="nil"/>
+          <w:bottom w:space="0" w:sz="0" w:val="nil"/>
+          <w:right w:space="0" w:sz="0" w:val="nil"/>
+          <w:between w:space="0" w:sz="0" w:val="nil"/>
+        </w:pBdr>
+        <w:shd w:fill="auto" w:val="clear"/>
+        <w:spacing w:after="60" w:before="0" w:line="360" w:lineRule="auto"/>
+        <w:ind w:left="360" w:right="0" w:firstLine="0"/>
+        <w:jc w:val="left"/>
+        <w:rPr>
+          <w:rFonts w:ascii="Times New Roman" w:cs="Times New Roman" w:eastAsia="Times New Roman" w:hAnsi="Times New Roman"/>
+          <w:b w:val="0"/>
+          <w:bCs w:val="0"/>
+          <w:i w:val="0"/>
+          <w:iCs w:val="0"/>
+          <w:smallCaps w:val="0"/>
+          <w:strike w:val="0"/>
+          <w:color w:val="000000"/>
+          <w:sz w:val="24"/>
+          <w:szCs w:val="24"/>
+          <w:u w:val="none"/>
+          <w:shd w:fill="auto" w:val="clear"/>
+          <w:vertAlign w:val="baseline"/>
+        </w:rPr>
+      </w:pPr>
+      <w:r>
+        <w:rPr>
+          <w:rFonts w:ascii="Times New Roman" w:cs="Times New Roman" w:eastAsia="Times New Roman" w:hAnsi="Times New Roman"/>
+          <w:b w:val="0"/>
+          <w:bCs w:val="0"/>
+          <w:i w:val="0"/>
+          <w:iCs w:val="0"/>
+          <w:smallCaps w:val="0"/>
+          <w:strike w:val="0"/>
+          <w:color w:val="000000"/>
+          <w:sz w:val="24"/>
+          <w:szCs w:val="24"/>
+          <w:u w:val="none"/>
+          <w:shd w:fill="auto" w:val="clear"/>
+          <w:vertAlign w:val="baseline"/>
+          <w:rtl w:val="0"/>
+        </w:rPr>
+        <w:t xml:space="preserve">4. O Application Load Balancer recebe a </w:t>
+      </w:r>
+      <w:r>
+        <w:rPr>
+          <w:rtl w:val="0"/>
+        </w:rPr>
+        <w:t xml:space="preserve">requisição</w:t>
+      </w:r>
+      <w:r>
+        <w:rPr>
+          <w:rFonts w:ascii="Times New Roman" w:cs="Times New Roman" w:eastAsia="Times New Roman" w:hAnsi="Times New Roman"/>
+          <w:b w:val="0"/>
+          <w:bCs w:val="0"/>
+          <w:i w:val="0"/>
+          <w:iCs w:val="0"/>
+          <w:smallCaps w:val="0"/>
+          <w:strike w:val="0"/>
+          <w:color w:val="000000"/>
+          <w:sz w:val="24"/>
+          <w:szCs w:val="24"/>
+          <w:u w:val="none"/>
+          <w:shd w:fill="auto" w:val="clear"/>
+          <w:vertAlign w:val="baseline"/>
+          <w:rtl w:val="0"/>
+        </w:rPr>
+        <w:t xml:space="preserve"> </w:t>
+      </w:r>
+      <w:r>
+        <w:rPr>
+          <w:rtl w:val="0"/>
+        </w:rPr>
+        <w:t xml:space="preserve">válida</w:t>
+      </w:r>
+      <w:r>
+        <w:rPr>
+          <w:rFonts w:ascii="Times New Roman" w:cs="Times New Roman" w:eastAsia="Times New Roman" w:hAnsi="Times New Roman"/>
+          <w:b w:val="0"/>
+          <w:bCs w:val="0"/>
+          <w:i w:val="0"/>
+          <w:iCs w:val="0"/>
+          <w:smallCaps w:val="0"/>
+          <w:strike w:val="0"/>
+          <w:color w:val="000000"/>
+          <w:sz w:val="24"/>
+          <w:szCs w:val="24"/>
+          <w:u w:val="none"/>
+          <w:shd w:fill="auto" w:val="clear"/>
+          <w:vertAlign w:val="baseline"/>
+          <w:rtl w:val="0"/>
+        </w:rPr>
+        <w:t xml:space="preserve"> e distribui a carga para uma </w:t>
+      </w:r>
+      <w:r>
+        <w:rPr>
+          <w:rtl w:val="0"/>
+        </w:rPr>
+        <w:t xml:space="preserve">instância</w:t>
+      </w:r>
+      <w:r>
+        <w:rPr>
+          <w:rFonts w:ascii="Times New Roman" w:cs="Times New Roman" w:eastAsia="Times New Roman" w:hAnsi="Times New Roman"/>
+          <w:b w:val="0"/>
+          <w:bCs w:val="0"/>
+          <w:i w:val="0"/>
+          <w:iCs w:val="0"/>
+          <w:smallCaps w:val="0"/>
+          <w:strike w:val="0"/>
+          <w:color w:val="000000"/>
+          <w:sz w:val="24"/>
+          <w:szCs w:val="24"/>
+          <w:u w:val="none"/>
+          <w:shd w:fill="auto" w:val="clear"/>
+          <w:vertAlign w:val="baseline"/>
+          <w:rtl w:val="0"/>
+        </w:rPr>
+        <w:t xml:space="preserve"> EC2 </w:t>
+      </w:r>
+      <w:r>
+        <w:rPr>
+          <w:rtl w:val="0"/>
+        </w:rPr>
+        <w:t xml:space="preserve">saudável</w:t>
+      </w:r>
+      <w:r>
+        <w:rPr>
+          <w:rFonts w:ascii="Times New Roman" w:cs="Times New Roman" w:eastAsia="Times New Roman" w:hAnsi="Times New Roman"/>
+          <w:b w:val="0"/>
+          <w:bCs w:val="0"/>
+          <w:i w:val="0"/>
+          <w:iCs w:val="0"/>
+          <w:smallCaps w:val="0"/>
+          <w:strike w:val="0"/>
+          <w:color w:val="000000"/>
+          <w:sz w:val="24"/>
+          <w:szCs w:val="24"/>
+          <w:u w:val="none"/>
+          <w:shd w:fill="auto" w:val="clear"/>
+          <w:vertAlign w:val="baseline"/>
+          <w:rtl w:val="0"/>
+        </w:rPr>
+        <w:t xml:space="preserve">.</w:t>
+      </w:r>
+    </w:p>
+    <w:p>
+      <w:pPr>
+        <w:keepNext w:val="0"/>
+        <w:keepLines w:val="0"/>
+        <w:pageBreakBefore w:val="0"/>
+        <w:widowControl w:val="1"/>
+        <w:pBdr>
+          <w:top w:space="0" w:sz="0" w:val="nil"/>
+          <w:left w:space="0" w:sz="0" w:val="nil"/>
+          <w:bottom w:space="0" w:sz="0" w:val="nil"/>
+          <w:right w:space="0" w:sz="0" w:val="nil"/>
+          <w:between w:space="0" w:sz="0" w:val="nil"/>
+        </w:pBdr>
+        <w:shd w:fill="auto" w:val="clear"/>
+        <w:spacing w:after="60" w:before="0" w:line="360" w:lineRule="auto"/>
+        <w:ind w:left="360" w:right="0" w:firstLine="0"/>
+        <w:jc w:val="left"/>
+        <w:rPr>
+          <w:rFonts w:ascii="Times New Roman" w:cs="Times New Roman" w:eastAsia="Times New Roman" w:hAnsi="Times New Roman"/>
+          <w:b w:val="0"/>
+          <w:bCs w:val="0"/>
+          <w:i w:val="0"/>
+          <w:iCs w:val="0"/>
+          <w:smallCaps w:val="0"/>
+          <w:strike w:val="0"/>
+          <w:color w:val="000000"/>
+          <w:sz w:val="24"/>
+          <w:szCs w:val="24"/>
+          <w:u w:val="none"/>
+          <w:shd w:fill="auto" w:val="clear"/>
+          <w:vertAlign w:val="baseline"/>
+        </w:rPr>
+      </w:pPr>
+      <w:r>
+        <w:rPr>
+          <w:rFonts w:ascii="Times New Roman" w:cs="Times New Roman" w:eastAsia="Times New Roman" w:hAnsi="Times New Roman"/>
+          <w:b w:val="0"/>
+          <w:bCs w:val="0"/>
+          <w:i w:val="0"/>
+          <w:iCs w:val="0"/>
+          <w:smallCaps w:val="0"/>
+          <w:strike w:val="0"/>
+          <w:color w:val="000000"/>
+          <w:sz w:val="24"/>
+          <w:szCs w:val="24"/>
+          <w:u w:val="none"/>
+          <w:shd w:fill="auto" w:val="clear"/>
+          <w:vertAlign w:val="baseline"/>
+          <w:rtl w:val="0"/>
+        </w:rPr>
+        <w:t xml:space="preserve">5. A camada web recebe a chamada HTTP/HTTPS e a encaminha para a API da </w:t>
+      </w:r>
+      <w:r>
+        <w:rPr>
+          <w:rtl w:val="0"/>
+        </w:rPr>
+        <w:t xml:space="preserve">aplicação</w:t>
+      </w:r>
+      <w:r>
+        <w:rPr>
+          <w:rFonts w:ascii="Times New Roman" w:cs="Times New Roman" w:eastAsia="Times New Roman" w:hAnsi="Times New Roman"/>
+          <w:b w:val="0"/>
+          <w:bCs w:val="0"/>
+          <w:i w:val="0"/>
+          <w:iCs w:val="0"/>
+          <w:smallCaps w:val="0"/>
+          <w:strike w:val="0"/>
+          <w:color w:val="000000"/>
+          <w:sz w:val="24"/>
+          <w:szCs w:val="24"/>
+          <w:u w:val="none"/>
+          <w:shd w:fill="auto" w:val="clear"/>
+          <w:vertAlign w:val="baseline"/>
+          <w:rtl w:val="0"/>
+        </w:rPr>
+        <w:t xml:space="preserve">.</w:t>
+      </w:r>
+    </w:p>
+    <w:p>
+      <w:pPr>
+        <w:keepNext w:val="0"/>
+        <w:keepLines w:val="0"/>
+        <w:pageBreakBefore w:val="0"/>
+        <w:widowControl w:val="1"/>
+        <w:pBdr>
+          <w:top w:space="0" w:sz="0" w:val="nil"/>
+          <w:left w:space="0" w:sz="0" w:val="nil"/>
+          <w:bottom w:space="0" w:sz="0" w:val="nil"/>
+          <w:right w:space="0" w:sz="0" w:val="nil"/>
+          <w:between w:space="0" w:sz="0" w:val="nil"/>
+        </w:pBdr>
+        <w:shd w:fill="auto" w:val="clear"/>
+        <w:spacing w:after="60" w:before="0" w:line="360" w:lineRule="auto"/>
+        <w:ind w:left="360" w:right="0" w:firstLine="0"/>
+        <w:jc w:val="left"/>
+        <w:rPr>
+          <w:rFonts w:ascii="Times New Roman" w:cs="Times New Roman" w:eastAsia="Times New Roman" w:hAnsi="Times New Roman"/>
+          <w:b w:val="0"/>
+          <w:bCs w:val="0"/>
+          <w:i w:val="0"/>
+          <w:iCs w:val="0"/>
+          <w:smallCaps w:val="0"/>
+          <w:strike w:val="0"/>
+          <w:color w:val="000000"/>
+          <w:sz w:val="24"/>
+          <w:szCs w:val="24"/>
+          <w:u w:val="none"/>
+          <w:shd w:fill="auto" w:val="clear"/>
+          <w:vertAlign w:val="baseline"/>
+        </w:rPr>
+      </w:pPr>
+      <w:r>
+        <w:rPr>
+          <w:rFonts w:ascii="Times New Roman" w:cs="Times New Roman" w:eastAsia="Times New Roman" w:hAnsi="Times New Roman"/>
+          <w:b w:val="0"/>
+          <w:bCs w:val="0"/>
+          <w:i w:val="0"/>
+          <w:iCs w:val="0"/>
+          <w:smallCaps w:val="0"/>
+          <w:strike w:val="0"/>
+          <w:color w:val="000000"/>
+          <w:sz w:val="24"/>
+          <w:szCs w:val="24"/>
+          <w:u w:val="none"/>
+          <w:shd w:fill="auto" w:val="clear"/>
+          <w:vertAlign w:val="baseline"/>
+          <w:rtl w:val="0"/>
+        </w:rPr>
+        <w:t xml:space="preserve">6. A API executa a regra de </w:t>
+      </w:r>
+      <w:r>
+        <w:rPr>
+          <w:rtl w:val="0"/>
+        </w:rPr>
+        <w:t xml:space="preserve">negócio</w:t>
+      </w:r>
+      <w:r>
+        <w:rPr>
+          <w:rFonts w:ascii="Times New Roman" w:cs="Times New Roman" w:eastAsia="Times New Roman" w:hAnsi="Times New Roman"/>
+          <w:b w:val="0"/>
+          <w:bCs w:val="0"/>
+          <w:i w:val="0"/>
+          <w:iCs w:val="0"/>
+          <w:smallCaps w:val="0"/>
+          <w:strike w:val="0"/>
+          <w:color w:val="000000"/>
+          <w:sz w:val="24"/>
+          <w:szCs w:val="24"/>
+          <w:u w:val="none"/>
+          <w:shd w:fill="auto" w:val="clear"/>
+          <w:vertAlign w:val="baseline"/>
+          <w:rtl w:val="0"/>
+        </w:rPr>
+        <w:t xml:space="preserve">, acionando </w:t>
+      </w:r>
+      <w:r>
+        <w:rPr>
+          <w:rtl w:val="0"/>
+        </w:rPr>
+        <w:t xml:space="preserve">módulos</w:t>
+      </w:r>
+      <w:r>
+        <w:rPr>
+          <w:rFonts w:ascii="Times New Roman" w:cs="Times New Roman" w:eastAsia="Times New Roman" w:hAnsi="Times New Roman"/>
+          <w:b w:val="0"/>
+          <w:bCs w:val="0"/>
+          <w:i w:val="0"/>
+          <w:iCs w:val="0"/>
+          <w:smallCaps w:val="0"/>
+          <w:strike w:val="0"/>
+          <w:color w:val="000000"/>
+          <w:sz w:val="24"/>
+          <w:szCs w:val="24"/>
+          <w:u w:val="none"/>
+          <w:shd w:fill="auto" w:val="clear"/>
+          <w:vertAlign w:val="baseline"/>
+          <w:rtl w:val="0"/>
+        </w:rPr>
+        <w:t xml:space="preserve"> como </w:t>
+      </w:r>
+      <w:r>
+        <w:rPr>
+          <w:rtl w:val="0"/>
+        </w:rPr>
+        <w:t xml:space="preserve">autenticação</w:t>
+      </w:r>
+      <w:r>
+        <w:rPr>
+          <w:rFonts w:ascii="Times New Roman" w:cs="Times New Roman" w:eastAsia="Times New Roman" w:hAnsi="Times New Roman"/>
+          <w:b w:val="0"/>
+          <w:bCs w:val="0"/>
+          <w:i w:val="0"/>
+          <w:iCs w:val="0"/>
+          <w:smallCaps w:val="0"/>
+          <w:strike w:val="0"/>
+          <w:color w:val="000000"/>
+          <w:sz w:val="24"/>
+          <w:szCs w:val="24"/>
+          <w:u w:val="none"/>
+          <w:shd w:fill="auto" w:val="clear"/>
+          <w:vertAlign w:val="baseline"/>
+          <w:rtl w:val="0"/>
+        </w:rPr>
+        <w:t xml:space="preserve">, </w:t>
+      </w:r>
+      <w:r>
+        <w:rPr>
+          <w:rtl w:val="0"/>
+        </w:rPr>
+        <w:t xml:space="preserve">catálogo</w:t>
+      </w:r>
+      <w:r>
+        <w:rPr>
+          <w:rFonts w:ascii="Times New Roman" w:cs="Times New Roman" w:eastAsia="Times New Roman" w:hAnsi="Times New Roman"/>
+          <w:b w:val="0"/>
+          <w:bCs w:val="0"/>
+          <w:i w:val="0"/>
+          <w:iCs w:val="0"/>
+          <w:smallCaps w:val="0"/>
+          <w:strike w:val="0"/>
+          <w:color w:val="000000"/>
+          <w:sz w:val="24"/>
+          <w:szCs w:val="24"/>
+          <w:u w:val="none"/>
+          <w:shd w:fill="auto" w:val="clear"/>
+          <w:vertAlign w:val="baseline"/>
+          <w:rtl w:val="0"/>
+        </w:rPr>
+        <w:t xml:space="preserve">, carrinho, checkout e pedidos.</w:t>
+      </w:r>
+    </w:p>
+    <w:p>
+      <w:pPr>
+        <w:keepNext w:val="0"/>
+        <w:keepLines w:val="0"/>
+        <w:pageBreakBefore w:val="0"/>
+        <w:widowControl w:val="1"/>
+        <w:pBdr>
+          <w:top w:space="0" w:sz="0" w:val="nil"/>
+          <w:left w:space="0" w:sz="0" w:val="nil"/>
+          <w:bottom w:space="0" w:sz="0" w:val="nil"/>
+          <w:right w:space="0" w:sz="0" w:val="nil"/>
+          <w:between w:space="0" w:sz="0" w:val="nil"/>
+        </w:pBdr>
+        <w:shd w:fill="auto" w:val="clear"/>
+        <w:spacing w:after="60" w:before="0" w:line="360" w:lineRule="auto"/>
+        <w:ind w:left="360" w:right="0" w:firstLine="0"/>
+        <w:jc w:val="left"/>
+        <w:rPr>
+          <w:rFonts w:ascii="Times New Roman" w:cs="Times New Roman" w:eastAsia="Times New Roman" w:hAnsi="Times New Roman"/>
+          <w:b w:val="0"/>
+          <w:bCs w:val="0"/>
+          <w:i w:val="0"/>
+          <w:iCs w:val="0"/>
+          <w:smallCaps w:val="0"/>
+          <w:strike w:val="0"/>
+          <w:color w:val="000000"/>
+          <w:sz w:val="24"/>
+          <w:szCs w:val="24"/>
+          <w:u w:val="none"/>
+          <w:shd w:fill="auto" w:val="clear"/>
+          <w:vertAlign w:val="baseline"/>
+        </w:rPr>
+      </w:pPr>
+      <w:r>
+        <w:rPr>
+          <w:rFonts w:ascii="Times New Roman" w:cs="Times New Roman" w:eastAsia="Times New Roman" w:hAnsi="Times New Roman"/>
+          <w:b w:val="0"/>
+          <w:bCs w:val="0"/>
+          <w:i w:val="0"/>
+          <w:iCs w:val="0"/>
+          <w:smallCaps w:val="0"/>
+          <w:strike w:val="0"/>
+          <w:color w:val="000000"/>
+          <w:sz w:val="24"/>
+          <w:szCs w:val="24"/>
+          <w:u w:val="none"/>
+          <w:shd w:fill="auto" w:val="clear"/>
+          <w:vertAlign w:val="baseline"/>
+          <w:rtl w:val="0"/>
+        </w:rPr>
+        <w:t xml:space="preserve">7. A camada de </w:t>
+      </w:r>
+      <w:r>
+        <w:rPr>
+          <w:rtl w:val="0"/>
+        </w:rPr>
+        <w:t xml:space="preserve">persistência</w:t>
+      </w:r>
+      <w:r>
+        <w:rPr>
+          <w:rFonts w:ascii="Times New Roman" w:cs="Times New Roman" w:eastAsia="Times New Roman" w:hAnsi="Times New Roman"/>
+          <w:b w:val="0"/>
+          <w:bCs w:val="0"/>
+          <w:i w:val="0"/>
+          <w:iCs w:val="0"/>
+          <w:smallCaps w:val="0"/>
+          <w:strike w:val="0"/>
+          <w:color w:val="000000"/>
+          <w:sz w:val="24"/>
+          <w:szCs w:val="24"/>
+          <w:u w:val="none"/>
+          <w:shd w:fill="auto" w:val="clear"/>
+          <w:vertAlign w:val="baseline"/>
+          <w:rtl w:val="0"/>
+        </w:rPr>
+        <w:t xml:space="preserve"> realiza leitura e escrita no Amazon RDS Multi-AZ quando </w:t>
+      </w:r>
+      <w:r>
+        <w:rPr>
+          <w:rtl w:val="0"/>
+        </w:rPr>
+        <w:t xml:space="preserve">há necessidade</w:t>
+      </w:r>
+      <w:r>
+        <w:rPr>
+          <w:rFonts w:ascii="Times New Roman" w:cs="Times New Roman" w:eastAsia="Times New Roman" w:hAnsi="Times New Roman"/>
+          <w:b w:val="0"/>
+          <w:bCs w:val="0"/>
+          <w:i w:val="0"/>
+          <w:iCs w:val="0"/>
+          <w:smallCaps w:val="0"/>
+          <w:strike w:val="0"/>
+          <w:color w:val="000000"/>
+          <w:sz w:val="24"/>
+          <w:szCs w:val="24"/>
+          <w:u w:val="none"/>
+          <w:shd w:fill="auto" w:val="clear"/>
+          <w:vertAlign w:val="baseline"/>
+          <w:rtl w:val="0"/>
+        </w:rPr>
+        <w:t xml:space="preserve"> de dados.</w:t>
+      </w:r>
+    </w:p>
+    <w:p>
+      <w:pPr>
+        <w:keepNext w:val="0"/>
+        <w:keepLines w:val="0"/>
+        <w:pageBreakBefore w:val="0"/>
+        <w:widowControl w:val="1"/>
+        <w:pBdr>
+          <w:top w:space="0" w:sz="0" w:val="nil"/>
+          <w:left w:space="0" w:sz="0" w:val="nil"/>
+          <w:bottom w:space="0" w:sz="0" w:val="nil"/>
+          <w:right w:space="0" w:sz="0" w:val="nil"/>
+          <w:between w:space="0" w:sz="0" w:val="nil"/>
+        </w:pBdr>
+        <w:shd w:fill="auto" w:val="clear"/>
+        <w:spacing w:after="60" w:before="0" w:line="360" w:lineRule="auto"/>
+        <w:ind w:left="360" w:right="0" w:firstLine="0"/>
+        <w:jc w:val="left"/>
+        <w:rPr>
+          <w:rFonts w:ascii="Times New Roman" w:cs="Times New Roman" w:eastAsia="Times New Roman" w:hAnsi="Times New Roman"/>
+          <w:b w:val="0"/>
+          <w:bCs w:val="0"/>
+          <w:i w:val="0"/>
+          <w:iCs w:val="0"/>
+          <w:smallCaps w:val="0"/>
+          <w:strike w:val="0"/>
+          <w:color w:val="000000"/>
+          <w:sz w:val="24"/>
+          <w:szCs w:val="24"/>
+          <w:u w:val="none"/>
+          <w:shd w:fill="auto" w:val="clear"/>
+          <w:vertAlign w:val="baseline"/>
+        </w:rPr>
+      </w:pPr>
+      <w:r>
+        <w:rPr>
+          <w:rFonts w:ascii="Times New Roman" w:cs="Times New Roman" w:eastAsia="Times New Roman" w:hAnsi="Times New Roman"/>
+          <w:b w:val="0"/>
+          <w:bCs w:val="0"/>
+          <w:i w:val="0"/>
+          <w:iCs w:val="0"/>
+          <w:smallCaps w:val="0"/>
+          <w:strike w:val="0"/>
+          <w:color w:val="000000"/>
+          <w:sz w:val="24"/>
+          <w:szCs w:val="24"/>
+          <w:u w:val="none"/>
+          <w:shd w:fill="auto" w:val="clear"/>
+          <w:vertAlign w:val="baseline"/>
+          <w:rtl w:val="0"/>
+        </w:rPr>
+        <w:t xml:space="preserve">8. CloudWatch registra logs, </w:t>
+      </w:r>
+      <w:r>
+        <w:rPr>
+          <w:rtl w:val="0"/>
+        </w:rPr>
+        <w:t xml:space="preserve">métricas</w:t>
+      </w:r>
+      <w:r>
+        <w:rPr>
+          <w:rFonts w:ascii="Times New Roman" w:cs="Times New Roman" w:eastAsia="Times New Roman" w:hAnsi="Times New Roman"/>
+          <w:b w:val="0"/>
+          <w:bCs w:val="0"/>
+          <w:i w:val="0"/>
+          <w:iCs w:val="0"/>
+          <w:smallCaps w:val="0"/>
+          <w:strike w:val="0"/>
+          <w:color w:val="000000"/>
+          <w:sz w:val="24"/>
+          <w:szCs w:val="24"/>
+          <w:u w:val="none"/>
+          <w:shd w:fill="auto" w:val="clear"/>
+          <w:vertAlign w:val="baseline"/>
+          <w:rtl w:val="0"/>
+        </w:rPr>
+        <w:t xml:space="preserve"> e eventos operacionais ao longo do processamento.</w:t>
+      </w:r>
+    </w:p>
+    <w:p>
+      <w:pPr>
+        <w:keepNext w:val="0"/>
+        <w:keepLines w:val="0"/>
+        <w:pageBreakBefore w:val="0"/>
+        <w:widowControl w:val="1"/>
+        <w:pBdr>
+          <w:top w:space="0" w:sz="0" w:val="nil"/>
+          <w:left w:space="0" w:sz="0" w:val="nil"/>
+          <w:bottom w:space="0" w:sz="0" w:val="nil"/>
+          <w:right w:space="0" w:sz="0" w:val="nil"/>
+          <w:between w:space="0" w:sz="0" w:val="nil"/>
+        </w:pBdr>
+        <w:shd w:fill="auto" w:val="clear"/>
+        <w:spacing w:after="60" w:before="0" w:line="360" w:lineRule="auto"/>
+        <w:ind w:left="360" w:right="0" w:firstLine="0"/>
+        <w:jc w:val="left"/>
+        <w:rPr>
+          <w:rFonts w:ascii="Times New Roman" w:cs="Times New Roman" w:eastAsia="Times New Roman" w:hAnsi="Times New Roman"/>
+          <w:b w:val="0"/>
+          <w:bCs w:val="0"/>
+          <w:i w:val="0"/>
+          <w:iCs w:val="0"/>
+          <w:smallCaps w:val="0"/>
+          <w:strike w:val="0"/>
+          <w:color w:val="000000"/>
+          <w:sz w:val="24"/>
+          <w:szCs w:val="24"/>
+          <w:u w:val="none"/>
+          <w:shd w:fill="auto" w:val="clear"/>
+          <w:vertAlign w:val="baseline"/>
+        </w:rPr>
+      </w:pPr>
+      <w:r>
+        <w:rPr>
+          <w:rFonts w:ascii="Times New Roman" w:cs="Times New Roman" w:eastAsia="Times New Roman" w:hAnsi="Times New Roman"/>
+          <w:b w:val="0"/>
+          <w:bCs w:val="0"/>
+          <w:i w:val="0"/>
+          <w:iCs w:val="0"/>
+          <w:smallCaps w:val="0"/>
+          <w:strike w:val="0"/>
+          <w:color w:val="000000"/>
+          <w:sz w:val="24"/>
+          <w:szCs w:val="24"/>
+          <w:u w:val="none"/>
+          <w:shd w:fill="auto" w:val="clear"/>
+          <w:vertAlign w:val="baseline"/>
+          <w:rtl w:val="0"/>
+        </w:rPr>
+        <w:t xml:space="preserve">9. AWS Backup </w:t>
+      </w:r>
+      <w:r>
+        <w:rPr>
+          <w:rtl w:val="0"/>
+        </w:rPr>
+        <w:t xml:space="preserve">mantém</w:t>
+      </w:r>
+      <w:r>
+        <w:rPr>
+          <w:rFonts w:ascii="Times New Roman" w:cs="Times New Roman" w:eastAsia="Times New Roman" w:hAnsi="Times New Roman"/>
+          <w:b w:val="0"/>
+          <w:bCs w:val="0"/>
+          <w:i w:val="0"/>
+          <w:iCs w:val="0"/>
+          <w:smallCaps w:val="0"/>
+          <w:strike w:val="0"/>
+          <w:color w:val="000000"/>
+          <w:sz w:val="24"/>
+          <w:szCs w:val="24"/>
+          <w:u w:val="none"/>
+          <w:shd w:fill="auto" w:val="clear"/>
+          <w:vertAlign w:val="baseline"/>
+          <w:rtl w:val="0"/>
+        </w:rPr>
+        <w:t xml:space="preserve"> a </w:t>
+      </w:r>
+      <w:r>
+        <w:rPr>
+          <w:rtl w:val="0"/>
+        </w:rPr>
+        <w:t xml:space="preserve">proteção</w:t>
+      </w:r>
+      <w:r>
+        <w:rPr>
+          <w:rFonts w:ascii="Times New Roman" w:cs="Times New Roman" w:eastAsia="Times New Roman" w:hAnsi="Times New Roman"/>
+          <w:b w:val="0"/>
+          <w:bCs w:val="0"/>
+          <w:i w:val="0"/>
+          <w:iCs w:val="0"/>
+          <w:smallCaps w:val="0"/>
+          <w:strike w:val="0"/>
+          <w:color w:val="000000"/>
+          <w:sz w:val="24"/>
+          <w:szCs w:val="24"/>
+          <w:u w:val="none"/>
+          <w:shd w:fill="auto" w:val="clear"/>
+          <w:vertAlign w:val="baseline"/>
+          <w:rtl w:val="0"/>
+        </w:rPr>
+        <w:t xml:space="preserve"> da base de dados para </w:t>
+      </w:r>
+      <w:r>
+        <w:rPr>
+          <w:rtl w:val="0"/>
+        </w:rPr>
+        <w:t xml:space="preserve">restauração</w:t>
+      </w:r>
+      <w:r>
+        <w:rPr>
+          <w:rFonts w:ascii="Times New Roman" w:cs="Times New Roman" w:eastAsia="Times New Roman" w:hAnsi="Times New Roman"/>
+          <w:b w:val="0"/>
+          <w:bCs w:val="0"/>
+          <w:i w:val="0"/>
+          <w:iCs w:val="0"/>
+          <w:smallCaps w:val="0"/>
+          <w:strike w:val="0"/>
+          <w:color w:val="000000"/>
+          <w:sz w:val="24"/>
+          <w:szCs w:val="24"/>
+          <w:u w:val="none"/>
+          <w:shd w:fill="auto" w:val="clear"/>
+          <w:vertAlign w:val="baseline"/>
+          <w:rtl w:val="0"/>
+        </w:rPr>
+        <w:t xml:space="preserve"> e </w:t>
+      </w:r>
+      <w:r>
+        <w:rPr>
+          <w:rtl w:val="0"/>
+        </w:rPr>
+        <w:t xml:space="preserve">recuperação</w:t>
+      </w:r>
+      <w:r>
+        <w:rPr>
+          <w:rFonts w:ascii="Times New Roman" w:cs="Times New Roman" w:eastAsia="Times New Roman" w:hAnsi="Times New Roman"/>
+          <w:b w:val="0"/>
+          <w:bCs w:val="0"/>
+          <w:i w:val="0"/>
+          <w:iCs w:val="0"/>
+          <w:smallCaps w:val="0"/>
+          <w:strike w:val="0"/>
+          <w:color w:val="000000"/>
+          <w:sz w:val="24"/>
+          <w:szCs w:val="24"/>
+          <w:u w:val="none"/>
+          <w:shd w:fill="auto" w:val="clear"/>
+          <w:vertAlign w:val="baseline"/>
+          <w:rtl w:val="0"/>
+        </w:rPr>
+        <w:t xml:space="preserve"> de desastres.</w:t>
+      </w:r>
+    </w:p>
+    <w:p>
+      <w:pPr>
+        <w:keepNext w:val="0"/>
+        <w:keepLines w:val="0"/>
+        <w:pageBreakBefore w:val="0"/>
+        <w:widowControl w:val="1"/>
+        <w:pBdr>
+          <w:top w:space="0" w:sz="0" w:val="nil"/>
+          <w:left w:space="0" w:sz="0" w:val="nil"/>
+          <w:bottom w:space="0" w:sz="0" w:val="nil"/>
+          <w:right w:space="0" w:sz="0" w:val="nil"/>
+          <w:between w:space="0" w:sz="0" w:val="nil"/>
+        </w:pBdr>
+        <w:shd w:fill="auto" w:val="clear"/>
+        <w:spacing w:after="60" w:before="0" w:line="360" w:lineRule="auto"/>
+        <w:ind w:left="360" w:right="0" w:firstLine="0"/>
+        <w:jc w:val="left"/>
+        <w:rPr>
+          <w:rFonts w:ascii="Times New Roman" w:cs="Times New Roman" w:eastAsia="Times New Roman" w:hAnsi="Times New Roman"/>
+          <w:b w:val="0"/>
+          <w:bCs w:val="0"/>
+          <w:i w:val="0"/>
+          <w:iCs w:val="0"/>
+          <w:smallCaps w:val="0"/>
+          <w:strike w:val="0"/>
+          <w:color w:val="000000"/>
+          <w:sz w:val="24"/>
+          <w:szCs w:val="24"/>
+          <w:u w:val="none"/>
+          <w:shd w:fill="auto" w:val="clear"/>
+          <w:vertAlign w:val="baseline"/>
+        </w:rPr>
+      </w:pPr>
+      <w:r>
+        <w:rPr>
+          <w:rFonts w:ascii="Times New Roman" w:cs="Times New Roman" w:eastAsia="Times New Roman" w:hAnsi="Times New Roman"/>
+          <w:b w:val="0"/>
+          <w:bCs w:val="0"/>
+          <w:i w:val="0"/>
+          <w:iCs w:val="0"/>
+          <w:smallCaps w:val="0"/>
+          <w:strike w:val="0"/>
+          <w:color w:val="000000"/>
+          <w:sz w:val="24"/>
+          <w:szCs w:val="24"/>
+          <w:u w:val="none"/>
+          <w:shd w:fill="auto" w:val="clear"/>
+          <w:vertAlign w:val="baseline"/>
+          <w:rtl w:val="0"/>
+        </w:rPr>
+        <w:t xml:space="preserve">10. A resposta retorna pela mesma cadeia </w:t>
+      </w:r>
+      <w:r>
+        <w:rPr>
+          <w:rtl w:val="0"/>
+        </w:rPr>
+        <w:t xml:space="preserve">até</w:t>
+      </w:r>
+      <w:r>
+        <w:rPr>
+          <w:rFonts w:ascii="Times New Roman" w:cs="Times New Roman" w:eastAsia="Times New Roman" w:hAnsi="Times New Roman"/>
+          <w:b w:val="0"/>
+          <w:bCs w:val="0"/>
+          <w:i w:val="0"/>
+          <w:iCs w:val="0"/>
+          <w:smallCaps w:val="0"/>
+          <w:strike w:val="0"/>
+          <w:color w:val="000000"/>
+          <w:sz w:val="24"/>
+          <w:szCs w:val="24"/>
+          <w:u w:val="none"/>
+          <w:shd w:fill="auto" w:val="clear"/>
+          <w:vertAlign w:val="baseline"/>
+          <w:rtl w:val="0"/>
+        </w:rPr>
+        <w:t xml:space="preserve"> chegar ao </w:t>
+      </w:r>
+      <w:r>
+        <w:rPr>
+          <w:rtl w:val="0"/>
+        </w:rPr>
+        <w:t xml:space="preserve">usuário</w:t>
+      </w:r>
+      <w:r>
+        <w:rPr>
+          <w:rFonts w:ascii="Times New Roman" w:cs="Times New Roman" w:eastAsia="Times New Roman" w:hAnsi="Times New Roman"/>
+          <w:b w:val="0"/>
+          <w:bCs w:val="0"/>
+          <w:i w:val="0"/>
+          <w:iCs w:val="0"/>
+          <w:smallCaps w:val="0"/>
+          <w:strike w:val="0"/>
+          <w:color w:val="000000"/>
+          <w:sz w:val="24"/>
+          <w:szCs w:val="24"/>
+          <w:u w:val="none"/>
+          <w:shd w:fill="auto" w:val="clear"/>
+          <w:vertAlign w:val="baseline"/>
+          <w:rtl w:val="0"/>
+        </w:rPr>
+        <w:t xml:space="preserve"> final.</w:t>
       </w:r>
     </w:p>
     <w:p>
@@ -9920,6 +12545,32 @@
       <w:jc w:val="center"/>
     </w:pPr>
     <w:rPr/>
+  </w:style>
+  <w:style w:type="table" w:styleId="Table1">
+    <w:basedOn w:val="TableNormal"/>
+    <w:tblPr>
+      <w:tblStyleRowBandSize w:val="1"/>
+      <w:tblStyleColBandSize w:val="1"/>
+      <w:tblCellMar>
+        <w:top w:w="0.0" w:type="dxa"/>
+        <w:left w:w="115.0" w:type="dxa"/>
+        <w:bottom w:w="0.0" w:type="dxa"/>
+        <w:right w:w="115.0" w:type="dxa"/>
+      </w:tblCellMar>
+    </w:tblPr>
+  </w:style>
+  <w:style w:type="table" w:styleId="Table2">
+    <w:basedOn w:val="TableNormal"/>
+    <w:tblPr>
+      <w:tblStyleRowBandSize w:val="1"/>
+      <w:tblStyleColBandSize w:val="1"/>
+      <w:tblCellMar>
+        <w:top w:w="0.0" w:type="dxa"/>
+        <w:left w:w="115.0" w:type="dxa"/>
+        <w:bottom w:w="0.0" w:type="dxa"/>
+        <w:right w:w="115.0" w:type="dxa"/>
+      </w:tblCellMar>
+    </w:tblPr>
   </w:style>
 </w:styles>
 </file>

</xml_diff>